<commit_message>
docs: Update IEEE paper and project report for Groq conversational AI & PiCamera Module 3
</commit_message>
<xml_diff>
--- a/Kenza_Project_Report.docx
+++ b/Kenza_Project_Report.docx
@@ -61,10 +61,10 @@
         <w:pStyle w:val="ListBullet"/>
       </w:pPr>
       <w:r>
-        <w:t xml:space="preserve">Real-time video streaming: Low-latency WebRTC (VP8/VP9) via </w:t>
+        <w:t>Real-time video streaming: Low-latency WebRTC (VP8/VP9) via PiCamera</w:t>
       </w:r>
       <w:r>
-        <w:t>RPI Camera Module 3</w:t>
+        <w:t xml:space="preserve"> Module 3</w:t>
       </w:r>
       <w:r>
         <w:t>.</w:t>
@@ -131,7 +131,15 @@
         <w:pStyle w:val="ListBullet"/>
       </w:pPr>
       <w:r>
-        <w:t>Conversation Engine: Tri-model pipeline routing queries to Cloud (Groq/Llama-3.3, Gemini 2.0) or Local (Llama 3.2 3B) models.</w:t>
+        <w:t>Conversation Engine: Multi-model pipeline routing queries to Groq (Llama-3.3-70b) for fast responses, and Gemini 2.0 Flash for vision tasks.</w:t>
+      </w:r>
+    </w:p>
+    <w:p>
+      <w:pPr>
+        <w:pStyle w:val="ListBullet"/>
+      </w:pPr>
+      <w:r>
+        <w:t>Local LLM Fallback: Offline support via Ollama (Gemma 3 Nano) or Llama 3.2 3B when internet is unavailable.</w:t>
       </w:r>
     </w:p>
     <w:p>
@@ -147,10 +155,7 @@
         <w:pStyle w:val="ListBullet"/>
       </w:pPr>
       <w:r>
-        <w:t>Multiple Avatar Selection: 5 distinct TTS voice presets (Kenza, Glitch, Kawaii, Titan, Jarvis)</w:t>
-      </w:r>
-      <w:r>
-        <w:t>.</w:t>
+        <w:t>Multiple Avatar Selection: 5 distinct TTS voice presets (Kenza, Glitch, Kawaii, Titan, Jarvis).</w:t>
       </w:r>
     </w:p>
     <w:p>
@@ -174,6 +179,7 @@
         <w:pStyle w:val="ListBullet"/>
       </w:pPr>
       <w:r>
+        <w:lastRenderedPageBreak/>
         <w:t>Display Visuals: Front-facing screen for telepresence feedback and emotional avatars.</w:t>
       </w:r>
     </w:p>
@@ -192,7 +198,6 @@
           <w:color w:val="2E74B5"/>
           <w:sz w:val="32"/>
         </w:rPr>
-        <w:lastRenderedPageBreak/>
         <w:t>3. Technical Specifications</w:t>
       </w:r>
     </w:p>
@@ -342,7 +347,7 @@
           </w:tcPr>
           <w:p>
             <w:r>
-              <w:t xml:space="preserve">Pi Camera Module 3 </w:t>
+              <w:t>Pi Camera Module 3 / PiCamera2</w:t>
             </w:r>
           </w:p>
         </w:tc>
@@ -406,7 +411,7 @@
           </w:tcPr>
           <w:p>
             <w:r>
-              <w:t xml:space="preserve">USB Speaker </w:t>
+              <w:t>USB Speaker / 3.5mm Jack</w:t>
             </w:r>
           </w:p>
         </w:tc>
@@ -470,7 +475,7 @@
           </w:tcPr>
           <w:p>
             <w:r>
-              <w:t xml:space="preserve">Custom 3D Printed </w:t>
+              <w:t>Custom 3D Printed + Metal Base</w:t>
             </w:r>
           </w:p>
         </w:tc>
@@ -723,28 +728,7 @@
           </w:tcPr>
           <w:p>
             <w:r>
-              <w:t>LLM (Cloud)</w:t>
-            </w:r>
-          </w:p>
-        </w:tc>
-        <w:tc>
-          <w:tcPr>
-            <w:tcW w:w="2880" w:type="dxa"/>
-          </w:tcPr>
-          <w:p>
-            <w:proofErr w:type="spellStart"/>
-            <w:r>
-              <w:t>Groq</w:t>
-            </w:r>
-            <w:proofErr w:type="spellEnd"/>
-            <w:r>
-              <w:t xml:space="preserve"> (Llama-3.3-70b), Gemini 2.</w:t>
-            </w:r>
-            <w:r>
-              <w:t>5</w:t>
-            </w:r>
-            <w:r>
-              <w:t xml:space="preserve"> Flash</w:t>
+              <w:t>LLM (Conversational)</w:t>
             </w:r>
           </w:p>
         </w:tc>
@@ -754,7 +738,49 @@
           </w:tcPr>
           <w:p>
             <w:r>
-              <w:t>API-based</w:t>
+              <w:t>Groq (Llama-3.3-70b)</w:t>
+            </w:r>
+          </w:p>
+        </w:tc>
+        <w:tc>
+          <w:tcPr>
+            <w:tcW w:w="2880" w:type="dxa"/>
+          </w:tcPr>
+          <w:p>
+            <w:r>
+              <w:t>Primary Chat</w:t>
+            </w:r>
+          </w:p>
+        </w:tc>
+      </w:tr>
+      <w:tr>
+        <w:tc>
+          <w:tcPr>
+            <w:tcW w:w="2880" w:type="dxa"/>
+          </w:tcPr>
+          <w:p>
+            <w:r>
+              <w:t>LLM (Vision AI)</w:t>
+            </w:r>
+          </w:p>
+        </w:tc>
+        <w:tc>
+          <w:tcPr>
+            <w:tcW w:w="2880" w:type="dxa"/>
+          </w:tcPr>
+          <w:p>
+            <w:r>
+              <w:t>Gemini 2.0 Flash</w:t>
+            </w:r>
+          </w:p>
+        </w:tc>
+        <w:tc>
+          <w:tcPr>
+            <w:tcW w:w="2880" w:type="dxa"/>
+          </w:tcPr>
+          <w:p>
+            <w:r>
+              <w:t>Multimodal / Vision</w:t>
             </w:r>
           </w:p>
         </w:tc>
@@ -776,7 +802,7 @@
           </w:tcPr>
           <w:p>
             <w:r>
-              <w:t>Llama 3.2 3B (Quantized GGUF)</w:t>
+              <w:t>Llama 3.2 3B / Ollama</w:t>
             </w:r>
           </w:p>
         </w:tc>
@@ -945,11 +971,8 @@
         <w:jc w:val="both"/>
       </w:pPr>
       <w:r>
-        <w:t xml:space="preserve">The conversation system uses a sophisticated 'Tri-Model' routing architecture. Audio is captured via PyAudio and processed by a Voice Activity Detector (RMS-based) to handle interruptions. Speech is transcribed using Google's Speech Recognition API. The text is sent to a Smart Router which decides the backend: 1) Groq (Llama 3.3) for fast, general conversation. 2) Gemini 2.0 Flash for vision-related queries (e.g., 'What do you see?'). 3) </w:t>
-      </w:r>
-      <w:r>
         <w:lastRenderedPageBreak/>
-        <w:t>Local Llama 3.2 if internet is unavailable. Responses are converted to audio using Microsoft Edge-TTS with selectable voice personalities.</w:t>
+        <w:t>The conversation system uses a high-performance routing architecture designed for zero-latency interaction. Audio is captured via PyAudio and processed by a Voice Activity Detector (RMS-based) to handle interruptions. Speech is transcribed using Google's Speech Recognition API. The text is sent to a Smart Router which determines the backend: 1) Groq (Llama 3.3) is the primary engine for lightning-fast, general conversation. 2) Gemini 2.0 Flash is utilized for vision-related queries (e.g., 'What do you see?') and as a secondary fallback. 3) Local Llama 3.2 / Ollama provides seamless interaction if internet connectivity is lost. Responses are converted to audio using Microsoft Edge-TTS with selectable voice personalities.</w:t>
       </w:r>
     </w:p>
     <w:p>
@@ -1000,2629 +1023,11 @@
     </w:p>
     <w:p>
       <w:pPr>
-        <w:spacing w:line="240" w:lineRule="auto"/>
         <w:jc w:val="both"/>
-        <w:rPr>
-          <w:b/>
-          <w:bCs/>
-          <w:sz w:val="20"/>
-          <w:szCs w:val="20"/>
-          <w:lang w:val="en-IN"/>
-        </w:rPr>
       </w:pPr>
       <w:r>
         <w:t>The Web Application serves as the primary control interface. It establishes a WebSocket connection for low-latency control (motor commands, settings) and telemetry (battery, temp). Video and Audio are streamed via WebRTC (using aiortc on the Pi). An Acoustic Echo Cancellation (AEC) filter prevents audio feedback loops, enabling clear two-way communication.</w:t>
       </w:r>
-      <w:r>
-        <w:br/>
-      </w:r>
-      <w:r>
-        <w:br/>
-      </w:r>
-      <w:r>
-        <w:br/>
-      </w:r>
-      <w:r>
-        <w:br/>
-      </w:r>
-      <w:r>
-        <w:rPr>
-          <w:sz w:val="40"/>
-          <w:szCs w:val="40"/>
-        </w:rPr>
-        <w:t>WORKFLOW OF KENZA</w:t>
-      </w:r>
-      <w:r>
-        <w:rPr>
-          <w:sz w:val="40"/>
-          <w:szCs w:val="40"/>
-        </w:rPr>
-        <w:br/>
-      </w:r>
-      <w:r>
-        <w:rPr>
-          <w:b/>
-          <w:bCs/>
-          <w:sz w:val="20"/>
-          <w:szCs w:val="20"/>
-          <w:lang w:val="en-IN"/>
-        </w:rPr>
-        <w:t>1. Boot &amp; Initialization (The "Wake Up")</w:t>
-      </w:r>
-    </w:p>
-    <w:p>
-      <w:pPr>
-        <w:spacing w:line="240" w:lineRule="auto"/>
-        <w:jc w:val="both"/>
-        <w:rPr>
-          <w:sz w:val="20"/>
-          <w:szCs w:val="20"/>
-          <w:lang w:val="en-IN"/>
-        </w:rPr>
-      </w:pPr>
-      <w:r>
-        <w:rPr>
-          <w:sz w:val="20"/>
-          <w:szCs w:val="20"/>
-          <w:lang w:val="en-IN"/>
-        </w:rPr>
-        <w:t>When Kenza is powered on, the main script </w:t>
-      </w:r>
-    </w:p>
-    <w:p>
-      <w:pPr>
-        <w:spacing w:line="240" w:lineRule="auto"/>
-        <w:jc w:val="both"/>
-        <w:rPr>
-          <w:sz w:val="20"/>
-          <w:szCs w:val="20"/>
-          <w:lang w:val="en-IN"/>
-        </w:rPr>
-      </w:pPr>
-      <w:r>
-        <w:rPr>
-          <w:sz w:val="20"/>
-          <w:szCs w:val="20"/>
-          <w:lang w:val="en-IN"/>
-        </w:rPr>
-        <w:t>RPI_kenza_main.py starts. This is the central brain that orchestrates everything.</w:t>
-      </w:r>
-    </w:p>
-    <w:p>
-      <w:pPr>
-        <w:numPr>
-          <w:ilvl w:val="0"/>
-          <w:numId w:val="10"/>
-        </w:numPr>
-        <w:spacing w:line="240" w:lineRule="auto"/>
-        <w:jc w:val="both"/>
-        <w:rPr>
-          <w:sz w:val="20"/>
-          <w:szCs w:val="20"/>
-          <w:lang w:val="en-IN"/>
-        </w:rPr>
-      </w:pPr>
-      <w:r>
-        <w:rPr>
-          <w:b/>
-          <w:bCs/>
-          <w:sz w:val="20"/>
-          <w:szCs w:val="20"/>
-          <w:lang w:val="en-IN"/>
-        </w:rPr>
-        <w:t>Hardware Check:</w:t>
-      </w:r>
-      <w:r>
-        <w:rPr>
-          <w:sz w:val="20"/>
-          <w:szCs w:val="20"/>
-          <w:lang w:val="en-IN"/>
-        </w:rPr>
-        <w:t> It initializes the Raspberry Pi's GPIO pins for motor control (using </w:t>
-      </w:r>
-    </w:p>
-    <w:p>
-      <w:pPr>
-        <w:spacing w:line="240" w:lineRule="auto"/>
-        <w:jc w:val="both"/>
-        <w:rPr>
-          <w:sz w:val="20"/>
-          <w:szCs w:val="20"/>
-          <w:lang w:val="en-IN"/>
-        </w:rPr>
-      </w:pPr>
-      <w:proofErr w:type="spellStart"/>
-      <w:r>
-        <w:rPr>
-          <w:sz w:val="20"/>
-          <w:szCs w:val="20"/>
-          <w:lang w:val="en-IN"/>
-        </w:rPr>
-        <w:t>gpiozero</w:t>
-      </w:r>
-      <w:proofErr w:type="spellEnd"/>
-    </w:p>
-    <w:p>
-      <w:pPr>
-        <w:spacing w:line="240" w:lineRule="auto"/>
-        <w:jc w:val="both"/>
-        <w:rPr>
-          <w:sz w:val="20"/>
-          <w:szCs w:val="20"/>
-          <w:lang w:val="en-IN"/>
-        </w:rPr>
-      </w:pPr>
-      <w:r>
-        <w:rPr>
-          <w:sz w:val="20"/>
-          <w:szCs w:val="20"/>
-          <w:lang w:val="en-IN"/>
-        </w:rPr>
-        <w:t xml:space="preserve">), sets up the camera, and prepares the audio </w:t>
-      </w:r>
-      <w:proofErr w:type="spellStart"/>
-      <w:r>
-        <w:rPr>
-          <w:sz w:val="20"/>
-          <w:szCs w:val="20"/>
-          <w:lang w:val="en-IN"/>
-        </w:rPr>
-        <w:t>systmem</w:t>
-      </w:r>
-      <w:proofErr w:type="spellEnd"/>
-      <w:r>
-        <w:rPr>
-          <w:sz w:val="20"/>
-          <w:szCs w:val="20"/>
-          <w:lang w:val="en-IN"/>
-        </w:rPr>
-        <w:t xml:space="preserve"> (microphone and speaker).</w:t>
-      </w:r>
-    </w:p>
-    <w:p>
-      <w:pPr>
-        <w:numPr>
-          <w:ilvl w:val="0"/>
-          <w:numId w:val="10"/>
-        </w:numPr>
-        <w:spacing w:line="240" w:lineRule="auto"/>
-        <w:jc w:val="both"/>
-        <w:rPr>
-          <w:sz w:val="20"/>
-          <w:szCs w:val="20"/>
-          <w:lang w:val="en-IN"/>
-        </w:rPr>
-      </w:pPr>
-      <w:r>
-        <w:rPr>
-          <w:b/>
-          <w:bCs/>
-          <w:sz w:val="20"/>
-          <w:szCs w:val="20"/>
-          <w:lang w:val="en-IN"/>
-        </w:rPr>
-        <w:t>Service Launch:</w:t>
-      </w:r>
-      <w:r>
-        <w:rPr>
-          <w:sz w:val="20"/>
-          <w:szCs w:val="20"/>
-          <w:lang w:val="en-IN"/>
-        </w:rPr>
-        <w:t> It spins up several background threads:</w:t>
-      </w:r>
-    </w:p>
-    <w:p>
-      <w:pPr>
-        <w:numPr>
-          <w:ilvl w:val="1"/>
-          <w:numId w:val="10"/>
-        </w:numPr>
-        <w:spacing w:line="240" w:lineRule="auto"/>
-        <w:jc w:val="both"/>
-        <w:rPr>
-          <w:sz w:val="20"/>
-          <w:szCs w:val="20"/>
-          <w:lang w:val="en-IN"/>
-        </w:rPr>
-      </w:pPr>
-      <w:r>
-        <w:rPr>
-          <w:b/>
-          <w:bCs/>
-          <w:sz w:val="20"/>
-          <w:szCs w:val="20"/>
-          <w:lang w:val="en-IN"/>
-        </w:rPr>
-        <w:t>WebSocket Server:</w:t>
-      </w:r>
-      <w:r>
-        <w:rPr>
-          <w:sz w:val="20"/>
-          <w:szCs w:val="20"/>
-          <w:lang w:val="en-IN"/>
-        </w:rPr>
-        <w:t> Starts listening on port </w:t>
-      </w:r>
-    </w:p>
-    <w:p>
-      <w:pPr>
-        <w:spacing w:line="240" w:lineRule="auto"/>
-        <w:jc w:val="both"/>
-        <w:rPr>
-          <w:sz w:val="20"/>
-          <w:szCs w:val="20"/>
-          <w:lang w:val="en-IN"/>
-        </w:rPr>
-      </w:pPr>
-      <w:r>
-        <w:rPr>
-          <w:sz w:val="20"/>
-          <w:szCs w:val="20"/>
-          <w:lang w:val="en-IN"/>
-        </w:rPr>
-        <w:t>8765</w:t>
-      </w:r>
-    </w:p>
-    <w:p>
-      <w:pPr>
-        <w:spacing w:line="240" w:lineRule="auto"/>
-        <w:jc w:val="both"/>
-        <w:rPr>
-          <w:sz w:val="20"/>
-          <w:szCs w:val="20"/>
-          <w:lang w:val="en-IN"/>
-        </w:rPr>
-      </w:pPr>
-      <w:r>
-        <w:rPr>
-          <w:sz w:val="20"/>
-          <w:szCs w:val="20"/>
-          <w:lang w:val="en-IN"/>
-        </w:rPr>
-        <w:t> for incoming connections from the web app.</w:t>
-      </w:r>
-    </w:p>
-    <w:p>
-      <w:pPr>
-        <w:numPr>
-          <w:ilvl w:val="1"/>
-          <w:numId w:val="10"/>
-        </w:numPr>
-        <w:spacing w:line="240" w:lineRule="auto"/>
-        <w:jc w:val="both"/>
-        <w:rPr>
-          <w:sz w:val="20"/>
-          <w:szCs w:val="20"/>
-          <w:lang w:val="en-IN"/>
-        </w:rPr>
-      </w:pPr>
-      <w:r>
-        <w:rPr>
-          <w:b/>
-          <w:bCs/>
-          <w:sz w:val="20"/>
-          <w:szCs w:val="20"/>
-          <w:lang w:val="en-IN"/>
-        </w:rPr>
-        <w:lastRenderedPageBreak/>
-        <w:t>AI Engine:</w:t>
-      </w:r>
-      <w:r>
-        <w:rPr>
-          <w:sz w:val="20"/>
-          <w:szCs w:val="20"/>
-          <w:lang w:val="en-IN"/>
-        </w:rPr>
-        <w:t> Loads the Conversation Engine (</w:t>
-      </w:r>
-    </w:p>
-    <w:p>
-      <w:pPr>
-        <w:spacing w:line="240" w:lineRule="auto"/>
-        <w:jc w:val="both"/>
-        <w:rPr>
-          <w:sz w:val="20"/>
-          <w:szCs w:val="20"/>
-          <w:lang w:val="en-IN"/>
-        </w:rPr>
-      </w:pPr>
-      <w:r>
-        <w:rPr>
-          <w:sz w:val="20"/>
-          <w:szCs w:val="20"/>
-          <w:lang w:val="en-IN"/>
-        </w:rPr>
-        <w:t>kenza_conversation.py) but keeps it in "listening" mode.</w:t>
-      </w:r>
-    </w:p>
-    <w:p>
-      <w:pPr>
-        <w:numPr>
-          <w:ilvl w:val="1"/>
-          <w:numId w:val="10"/>
-        </w:numPr>
-        <w:spacing w:line="240" w:lineRule="auto"/>
-        <w:jc w:val="both"/>
-        <w:rPr>
-          <w:sz w:val="20"/>
-          <w:szCs w:val="20"/>
-          <w:lang w:val="en-IN"/>
-        </w:rPr>
-      </w:pPr>
-      <w:r>
-        <w:rPr>
-          <w:b/>
-          <w:bCs/>
-          <w:sz w:val="20"/>
-          <w:szCs w:val="20"/>
-          <w:lang w:val="en-IN"/>
-        </w:rPr>
-        <w:t>Vision System:</w:t>
-      </w:r>
-      <w:r>
-        <w:rPr>
-          <w:sz w:val="20"/>
-          <w:szCs w:val="20"/>
-          <w:lang w:val="en-IN"/>
-        </w:rPr>
-        <w:t> Warms up the camera for gesture tracking and face detection.</w:t>
-      </w:r>
-    </w:p>
-    <w:p>
-      <w:pPr>
-        <w:spacing w:line="240" w:lineRule="auto"/>
-        <w:jc w:val="both"/>
-        <w:rPr>
-          <w:b/>
-          <w:bCs/>
-          <w:sz w:val="20"/>
-          <w:szCs w:val="20"/>
-          <w:lang w:val="en-IN"/>
-        </w:rPr>
-      </w:pPr>
-      <w:r>
-        <w:rPr>
-          <w:b/>
-          <w:bCs/>
-          <w:sz w:val="20"/>
-          <w:szCs w:val="20"/>
-          <w:lang w:val="en-IN"/>
-        </w:rPr>
-        <w:t>2. Connectivity (Getting Online)</w:t>
-      </w:r>
-    </w:p>
-    <w:p>
-      <w:pPr>
-        <w:spacing w:line="240" w:lineRule="auto"/>
-        <w:jc w:val="both"/>
-        <w:rPr>
-          <w:sz w:val="20"/>
-          <w:szCs w:val="20"/>
-          <w:lang w:val="en-IN"/>
-        </w:rPr>
-      </w:pPr>
-      <w:r>
-        <w:rPr>
-          <w:sz w:val="20"/>
-          <w:szCs w:val="20"/>
-          <w:lang w:val="en-IN"/>
-        </w:rPr>
-        <w:t>Kenza uses a "Zero-Config" approach to get connected:</w:t>
-      </w:r>
-    </w:p>
-    <w:p>
-      <w:pPr>
-        <w:numPr>
-          <w:ilvl w:val="0"/>
-          <w:numId w:val="11"/>
-        </w:numPr>
-        <w:spacing w:line="240" w:lineRule="auto"/>
-        <w:jc w:val="both"/>
-        <w:rPr>
-          <w:sz w:val="20"/>
-          <w:szCs w:val="20"/>
-          <w:lang w:val="en-IN"/>
-        </w:rPr>
-      </w:pPr>
-      <w:r>
-        <w:rPr>
-          <w:b/>
-          <w:bCs/>
-          <w:sz w:val="20"/>
-          <w:szCs w:val="20"/>
-          <w:lang w:val="en-IN"/>
-        </w:rPr>
-        <w:t>QR Pairing:</w:t>
-      </w:r>
-      <w:r>
-        <w:rPr>
-          <w:sz w:val="20"/>
-          <w:szCs w:val="20"/>
-          <w:lang w:val="en-IN"/>
-        </w:rPr>
-        <w:t> If Kenza isn't connected to Wi-Fi, the </w:t>
-      </w:r>
-    </w:p>
-    <w:p>
-      <w:pPr>
-        <w:spacing w:line="240" w:lineRule="auto"/>
-        <w:jc w:val="both"/>
-        <w:rPr>
-          <w:sz w:val="20"/>
-          <w:szCs w:val="20"/>
-          <w:lang w:val="en-IN"/>
-        </w:rPr>
-      </w:pPr>
-      <w:proofErr w:type="spellStart"/>
-      <w:r>
-        <w:rPr>
-          <w:sz w:val="20"/>
-          <w:szCs w:val="20"/>
-          <w:lang w:val="en-IN"/>
-        </w:rPr>
-        <w:t>QRScanner</w:t>
-      </w:r>
-      <w:proofErr w:type="spellEnd"/>
-      <w:r>
-        <w:rPr>
-          <w:sz w:val="20"/>
-          <w:szCs w:val="20"/>
-          <w:lang w:val="en-IN"/>
-        </w:rPr>
-        <w:t> module activates the camera to look for a specific QR code format (</w:t>
-      </w:r>
-    </w:p>
-    <w:p>
-      <w:pPr>
-        <w:spacing w:line="240" w:lineRule="auto"/>
-        <w:jc w:val="both"/>
-        <w:rPr>
-          <w:sz w:val="20"/>
-          <w:szCs w:val="20"/>
-          <w:lang w:val="en-IN"/>
-        </w:rPr>
-      </w:pPr>
-      <w:proofErr w:type="spellStart"/>
-      <w:r>
-        <w:rPr>
-          <w:sz w:val="20"/>
-          <w:szCs w:val="20"/>
-          <w:lang w:val="en-IN"/>
-        </w:rPr>
-        <w:t>WIFI</w:t>
-      </w:r>
-      <w:proofErr w:type="gramStart"/>
-      <w:r>
-        <w:rPr>
-          <w:sz w:val="20"/>
-          <w:szCs w:val="20"/>
-          <w:lang w:val="en-IN"/>
-        </w:rPr>
-        <w:t>:S:ssid</w:t>
-      </w:r>
-      <w:proofErr w:type="gramEnd"/>
-      <w:r>
-        <w:rPr>
-          <w:sz w:val="20"/>
-          <w:szCs w:val="20"/>
-          <w:lang w:val="en-IN"/>
-        </w:rPr>
-        <w:t>;</w:t>
-      </w:r>
-      <w:proofErr w:type="gramStart"/>
-      <w:r>
-        <w:rPr>
-          <w:sz w:val="20"/>
-          <w:szCs w:val="20"/>
-          <w:lang w:val="en-IN"/>
-        </w:rPr>
-        <w:t>P:password</w:t>
-      </w:r>
-      <w:proofErr w:type="spellEnd"/>
-      <w:proofErr w:type="gramEnd"/>
-    </w:p>
-    <w:p>
-      <w:pPr>
-        <w:spacing w:line="240" w:lineRule="auto"/>
-        <w:jc w:val="both"/>
-        <w:rPr>
-          <w:sz w:val="20"/>
-          <w:szCs w:val="20"/>
-          <w:lang w:val="en-IN"/>
-        </w:rPr>
-      </w:pPr>
-      <w:r>
-        <w:rPr>
-          <w:sz w:val="20"/>
-          <w:szCs w:val="20"/>
-          <w:lang w:val="en-IN"/>
-        </w:rPr>
-        <w:t>).</w:t>
-      </w:r>
-    </w:p>
-    <w:p>
-      <w:pPr>
-        <w:numPr>
-          <w:ilvl w:val="0"/>
-          <w:numId w:val="11"/>
-        </w:numPr>
-        <w:spacing w:line="240" w:lineRule="auto"/>
-        <w:jc w:val="both"/>
-        <w:rPr>
-          <w:sz w:val="20"/>
-          <w:szCs w:val="20"/>
-          <w:lang w:val="en-IN"/>
-        </w:rPr>
-      </w:pPr>
-      <w:r>
-        <w:rPr>
-          <w:b/>
-          <w:bCs/>
-          <w:sz w:val="20"/>
-          <w:szCs w:val="20"/>
-          <w:lang w:val="en-IN"/>
-        </w:rPr>
-        <w:t>Auto-Connect:</w:t>
-      </w:r>
-      <w:r>
-        <w:rPr>
-          <w:sz w:val="20"/>
-          <w:szCs w:val="20"/>
-          <w:lang w:val="en-IN"/>
-        </w:rPr>
-        <w:t> Once it sees the QR code, it automatically configures the Raspberry Pi's Wi-Fi network using </w:t>
-      </w:r>
-    </w:p>
-    <w:p>
-      <w:pPr>
-        <w:spacing w:line="240" w:lineRule="auto"/>
-        <w:jc w:val="both"/>
-        <w:rPr>
-          <w:sz w:val="20"/>
-          <w:szCs w:val="20"/>
-          <w:lang w:val="en-IN"/>
-        </w:rPr>
-      </w:pPr>
-      <w:proofErr w:type="spellStart"/>
-      <w:r>
-        <w:rPr>
-          <w:sz w:val="20"/>
-          <w:szCs w:val="20"/>
-          <w:lang w:val="en-IN"/>
-        </w:rPr>
-        <w:t>nmcli</w:t>
-      </w:r>
-      <w:proofErr w:type="spellEnd"/>
-    </w:p>
-    <w:p>
-      <w:pPr>
-        <w:spacing w:line="240" w:lineRule="auto"/>
-        <w:jc w:val="both"/>
-        <w:rPr>
-          <w:sz w:val="20"/>
-          <w:szCs w:val="20"/>
-          <w:lang w:val="en-IN"/>
-        </w:rPr>
-      </w:pPr>
-      <w:r>
-        <w:rPr>
-          <w:sz w:val="20"/>
-          <w:szCs w:val="20"/>
-          <w:lang w:val="en-IN"/>
-        </w:rPr>
-        <w:t> and connects to your router.</w:t>
-      </w:r>
-    </w:p>
-    <w:p>
-      <w:pPr>
-        <w:numPr>
-          <w:ilvl w:val="0"/>
-          <w:numId w:val="11"/>
-        </w:numPr>
-        <w:spacing w:line="240" w:lineRule="auto"/>
-        <w:jc w:val="both"/>
-        <w:rPr>
-          <w:sz w:val="20"/>
-          <w:szCs w:val="20"/>
-          <w:lang w:val="en-IN"/>
-        </w:rPr>
-      </w:pPr>
-      <w:r>
-        <w:rPr>
-          <w:b/>
-          <w:bCs/>
-          <w:sz w:val="20"/>
-          <w:szCs w:val="20"/>
-          <w:lang w:val="en-IN"/>
-        </w:rPr>
-        <w:t>Ready State:</w:t>
-      </w:r>
-      <w:r>
-        <w:rPr>
-          <w:sz w:val="20"/>
-          <w:szCs w:val="20"/>
-          <w:lang w:val="en-IN"/>
-        </w:rPr>
-        <w:t> Once online, Kenza is ready to accept commands from the web app or voice.</w:t>
-      </w:r>
-    </w:p>
-    <w:p>
-      <w:pPr>
-        <w:spacing w:line="240" w:lineRule="auto"/>
-        <w:jc w:val="both"/>
-        <w:rPr>
-          <w:b/>
-          <w:bCs/>
-          <w:sz w:val="20"/>
-          <w:szCs w:val="20"/>
-          <w:lang w:val="en-IN"/>
-        </w:rPr>
-      </w:pPr>
-      <w:r>
-        <w:rPr>
-          <w:b/>
-          <w:bCs/>
-          <w:sz w:val="20"/>
-          <w:szCs w:val="20"/>
-          <w:lang w:val="en-IN"/>
-        </w:rPr>
-        <w:t>3. The Conversation Loop (Hearing &amp; Speaking)</w:t>
-      </w:r>
-    </w:p>
-    <w:p>
-      <w:pPr>
-        <w:spacing w:line="240" w:lineRule="auto"/>
-        <w:jc w:val="both"/>
-        <w:rPr>
-          <w:sz w:val="20"/>
-          <w:szCs w:val="20"/>
-          <w:lang w:val="en-IN"/>
-        </w:rPr>
-      </w:pPr>
-      <w:r>
-        <w:rPr>
-          <w:sz w:val="20"/>
-          <w:szCs w:val="20"/>
-          <w:lang w:val="en-IN"/>
-        </w:rPr>
-        <w:t>This is the core "AI" workflow handled by </w:t>
-      </w:r>
-    </w:p>
-    <w:p>
-      <w:pPr>
-        <w:spacing w:line="240" w:lineRule="auto"/>
-        <w:jc w:val="both"/>
-        <w:rPr>
-          <w:sz w:val="20"/>
-          <w:szCs w:val="20"/>
-          <w:lang w:val="en-IN"/>
-        </w:rPr>
-      </w:pPr>
-      <w:r>
-        <w:rPr>
-          <w:sz w:val="20"/>
-          <w:szCs w:val="20"/>
-          <w:lang w:val="en-IN"/>
-        </w:rPr>
-        <w:t>kenza_conversation.py:</w:t>
-      </w:r>
-    </w:p>
-    <w:p>
-      <w:pPr>
-        <w:numPr>
-          <w:ilvl w:val="0"/>
-          <w:numId w:val="12"/>
-        </w:numPr>
-        <w:spacing w:line="240" w:lineRule="auto"/>
-        <w:jc w:val="both"/>
-        <w:rPr>
-          <w:sz w:val="20"/>
-          <w:szCs w:val="20"/>
-          <w:lang w:val="en-IN"/>
-        </w:rPr>
-      </w:pPr>
-      <w:r>
-        <w:rPr>
-          <w:b/>
-          <w:bCs/>
-          <w:sz w:val="20"/>
-          <w:szCs w:val="20"/>
-          <w:lang w:val="en-IN"/>
-        </w:rPr>
-        <w:t>Listening (STT):</w:t>
-      </w:r>
-      <w:r>
-        <w:rPr>
-          <w:sz w:val="20"/>
-          <w:szCs w:val="20"/>
-          <w:lang w:val="en-IN"/>
-        </w:rPr>
-        <w:t> The </w:t>
-      </w:r>
-    </w:p>
-    <w:p>
-      <w:pPr>
-        <w:spacing w:line="240" w:lineRule="auto"/>
-        <w:jc w:val="both"/>
-        <w:rPr>
-          <w:sz w:val="20"/>
-          <w:szCs w:val="20"/>
-          <w:lang w:val="en-IN"/>
-        </w:rPr>
-      </w:pPr>
-      <w:proofErr w:type="spellStart"/>
-      <w:r>
-        <w:rPr>
-          <w:sz w:val="20"/>
-          <w:szCs w:val="20"/>
-          <w:lang w:val="en-IN"/>
-        </w:rPr>
-        <w:t>SpeechRecognition</w:t>
-      </w:r>
-      <w:proofErr w:type="spellEnd"/>
-    </w:p>
-    <w:p>
-      <w:pPr>
-        <w:spacing w:line="240" w:lineRule="auto"/>
-        <w:jc w:val="both"/>
-        <w:rPr>
-          <w:sz w:val="20"/>
-          <w:szCs w:val="20"/>
-          <w:lang w:val="en-IN"/>
-        </w:rPr>
-      </w:pPr>
-      <w:r>
-        <w:rPr>
-          <w:sz w:val="20"/>
-          <w:szCs w:val="20"/>
-          <w:lang w:val="en-IN"/>
-        </w:rPr>
-        <w:t> library listens to the microphone. It waits for the </w:t>
-      </w:r>
-      <w:r>
-        <w:rPr>
-          <w:b/>
-          <w:bCs/>
-          <w:sz w:val="20"/>
-          <w:szCs w:val="20"/>
-          <w:lang w:val="en-IN"/>
-        </w:rPr>
-        <w:t>Wake Word</w:t>
-      </w:r>
-      <w:r>
-        <w:rPr>
-          <w:sz w:val="20"/>
-          <w:szCs w:val="20"/>
-          <w:lang w:val="en-IN"/>
-        </w:rPr>
-        <w:t> "Kenza".</w:t>
-      </w:r>
-    </w:p>
-    <w:p>
-      <w:pPr>
-        <w:numPr>
-          <w:ilvl w:val="0"/>
-          <w:numId w:val="12"/>
-        </w:numPr>
-        <w:spacing w:line="240" w:lineRule="auto"/>
-        <w:jc w:val="both"/>
-        <w:rPr>
-          <w:sz w:val="20"/>
-          <w:szCs w:val="20"/>
-          <w:lang w:val="en-IN"/>
-        </w:rPr>
-      </w:pPr>
-      <w:r>
-        <w:rPr>
-          <w:b/>
-          <w:bCs/>
-          <w:sz w:val="20"/>
-          <w:szCs w:val="20"/>
-          <w:lang w:val="en-IN"/>
-        </w:rPr>
-        <w:t>Thinking (Routing):</w:t>
-      </w:r>
-      <w:r>
-        <w:rPr>
-          <w:sz w:val="20"/>
-          <w:szCs w:val="20"/>
-          <w:lang w:val="en-IN"/>
-        </w:rPr>
-        <w:t> Once triggered, it captures your speech and sends the text to the </w:t>
-      </w:r>
-      <w:r>
-        <w:rPr>
-          <w:b/>
-          <w:bCs/>
-          <w:sz w:val="20"/>
-          <w:szCs w:val="20"/>
-          <w:lang w:val="en-IN"/>
-        </w:rPr>
-        <w:t>Smart Router</w:t>
-      </w:r>
-      <w:r>
-        <w:rPr>
-          <w:sz w:val="20"/>
-          <w:szCs w:val="20"/>
-          <w:lang w:val="en-IN"/>
-        </w:rPr>
-        <w:t>:</w:t>
-      </w:r>
-    </w:p>
-    <w:p>
-      <w:pPr>
-        <w:numPr>
-          <w:ilvl w:val="1"/>
-          <w:numId w:val="12"/>
-        </w:numPr>
-        <w:spacing w:line="240" w:lineRule="auto"/>
-        <w:jc w:val="both"/>
-        <w:rPr>
-          <w:sz w:val="20"/>
-          <w:szCs w:val="20"/>
-          <w:lang w:val="en-IN"/>
-        </w:rPr>
-      </w:pPr>
-      <w:r>
-        <w:rPr>
-          <w:b/>
-          <w:bCs/>
-          <w:sz w:val="20"/>
-          <w:szCs w:val="20"/>
-          <w:lang w:val="en-IN"/>
-        </w:rPr>
-        <w:t>General Chat:</w:t>
-      </w:r>
-      <w:r>
-        <w:rPr>
-          <w:sz w:val="20"/>
-          <w:szCs w:val="20"/>
-          <w:lang w:val="en-IN"/>
-        </w:rPr>
-        <w:t> Routed to </w:t>
-      </w:r>
-      <w:proofErr w:type="spellStart"/>
-      <w:r>
-        <w:rPr>
-          <w:b/>
-          <w:bCs/>
-          <w:sz w:val="20"/>
-          <w:szCs w:val="20"/>
-          <w:lang w:val="en-IN"/>
-        </w:rPr>
-        <w:t>Groq</w:t>
-      </w:r>
-      <w:proofErr w:type="spellEnd"/>
-      <w:r>
-        <w:rPr>
-          <w:sz w:val="20"/>
-          <w:szCs w:val="20"/>
-          <w:lang w:val="en-IN"/>
-        </w:rPr>
-        <w:t> (running Llama-3.3-70b) for fast, intelligent responses.</w:t>
-      </w:r>
-    </w:p>
-    <w:p>
-      <w:pPr>
-        <w:numPr>
-          <w:ilvl w:val="1"/>
-          <w:numId w:val="12"/>
-        </w:numPr>
-        <w:spacing w:line="240" w:lineRule="auto"/>
-        <w:jc w:val="both"/>
-        <w:rPr>
-          <w:sz w:val="20"/>
-          <w:szCs w:val="20"/>
-          <w:lang w:val="en-IN"/>
-        </w:rPr>
-      </w:pPr>
-      <w:r>
-        <w:rPr>
-          <w:b/>
-          <w:bCs/>
-          <w:sz w:val="20"/>
-          <w:szCs w:val="20"/>
-          <w:lang w:val="en-IN"/>
-        </w:rPr>
-        <w:t>Vision Questions:</w:t>
-      </w:r>
-      <w:r>
-        <w:rPr>
-          <w:sz w:val="20"/>
-          <w:szCs w:val="20"/>
-          <w:lang w:val="en-IN"/>
-        </w:rPr>
-        <w:t> Queries like "What do you see?" are routed to </w:t>
-      </w:r>
-      <w:r>
-        <w:rPr>
-          <w:b/>
-          <w:bCs/>
-          <w:sz w:val="20"/>
-          <w:szCs w:val="20"/>
-          <w:lang w:val="en-IN"/>
-        </w:rPr>
-        <w:t>Google Gemini 2.0</w:t>
-      </w:r>
-      <w:r>
-        <w:rPr>
-          <w:sz w:val="20"/>
-          <w:szCs w:val="20"/>
-          <w:lang w:val="en-IN"/>
-        </w:rPr>
-        <w:t>, along with a snapshot from the camera, so it can see what you see.</w:t>
-      </w:r>
-    </w:p>
-    <w:p>
-      <w:pPr>
-        <w:numPr>
-          <w:ilvl w:val="1"/>
-          <w:numId w:val="12"/>
-        </w:numPr>
-        <w:spacing w:line="240" w:lineRule="auto"/>
-        <w:jc w:val="both"/>
-        <w:rPr>
-          <w:sz w:val="20"/>
-          <w:szCs w:val="20"/>
-          <w:lang w:val="en-IN"/>
-        </w:rPr>
-      </w:pPr>
-      <w:r>
-        <w:rPr>
-          <w:b/>
-          <w:bCs/>
-          <w:sz w:val="20"/>
-          <w:szCs w:val="20"/>
-          <w:lang w:val="en-IN"/>
-        </w:rPr>
-        <w:t>Offline Fallback:</w:t>
-      </w:r>
-      <w:r>
-        <w:rPr>
-          <w:sz w:val="20"/>
-          <w:szCs w:val="20"/>
-          <w:lang w:val="en-IN"/>
-        </w:rPr>
-        <w:t> If the internet is down, it seamlessly switches to a local </w:t>
-      </w:r>
-      <w:r>
-        <w:rPr>
-          <w:b/>
-          <w:bCs/>
-          <w:sz w:val="20"/>
-          <w:szCs w:val="20"/>
-          <w:lang w:val="en-IN"/>
-        </w:rPr>
-        <w:t>Llama 3.2 3B</w:t>
-      </w:r>
-      <w:r>
-        <w:rPr>
-          <w:sz w:val="20"/>
-          <w:szCs w:val="20"/>
-          <w:lang w:val="en-IN"/>
-        </w:rPr>
-        <w:t> model running directly on the Pi.</w:t>
-      </w:r>
-    </w:p>
-    <w:p>
-      <w:pPr>
-        <w:numPr>
-          <w:ilvl w:val="0"/>
-          <w:numId w:val="12"/>
-        </w:numPr>
-        <w:spacing w:line="240" w:lineRule="auto"/>
-        <w:jc w:val="both"/>
-        <w:rPr>
-          <w:sz w:val="20"/>
-          <w:szCs w:val="20"/>
-          <w:lang w:val="en-IN"/>
-        </w:rPr>
-      </w:pPr>
-      <w:r>
-        <w:rPr>
-          <w:b/>
-          <w:bCs/>
-          <w:sz w:val="20"/>
-          <w:szCs w:val="20"/>
-          <w:lang w:val="en-IN"/>
-        </w:rPr>
-        <w:t>Speaking (TTS):</w:t>
-      </w:r>
-      <w:r>
-        <w:rPr>
-          <w:sz w:val="20"/>
-          <w:szCs w:val="20"/>
-          <w:lang w:val="en-IN"/>
-        </w:rPr>
-        <w:t> The response is converted to speech using </w:t>
-      </w:r>
-      <w:r>
-        <w:rPr>
-          <w:b/>
-          <w:bCs/>
-          <w:sz w:val="20"/>
-          <w:szCs w:val="20"/>
-          <w:lang w:val="en-IN"/>
-        </w:rPr>
-        <w:t>Edge-TTS</w:t>
-      </w:r>
-      <w:r>
-        <w:rPr>
-          <w:sz w:val="20"/>
-          <w:szCs w:val="20"/>
-          <w:lang w:val="en-IN"/>
-        </w:rPr>
-        <w:t> (Microsoft's neural voice). It supports 5 personalities (Kenza, Glitch, Kawaii, Titan, Jarvis).</w:t>
-      </w:r>
-    </w:p>
-    <w:p>
-      <w:pPr>
-        <w:numPr>
-          <w:ilvl w:val="1"/>
-          <w:numId w:val="12"/>
-        </w:numPr>
-        <w:spacing w:line="240" w:lineRule="auto"/>
-        <w:jc w:val="both"/>
-        <w:rPr>
-          <w:sz w:val="20"/>
-          <w:szCs w:val="20"/>
-          <w:lang w:val="en-IN"/>
-        </w:rPr>
-      </w:pPr>
-      <w:r>
-        <w:rPr>
-          <w:b/>
-          <w:bCs/>
-          <w:sz w:val="20"/>
-          <w:szCs w:val="20"/>
-          <w:lang w:val="en-IN"/>
-        </w:rPr>
-        <w:t>Interruption:</w:t>
-      </w:r>
-      <w:r>
-        <w:rPr>
-          <w:sz w:val="20"/>
-          <w:szCs w:val="20"/>
-          <w:lang w:val="en-IN"/>
-        </w:rPr>
-        <w:t> A Voice Activity Detector (VAD) monitors the mic </w:t>
-      </w:r>
-      <w:r>
-        <w:rPr>
-          <w:b/>
-          <w:bCs/>
-          <w:sz w:val="20"/>
-          <w:szCs w:val="20"/>
-          <w:lang w:val="en-IN"/>
-        </w:rPr>
-        <w:t>while</w:t>
-      </w:r>
-      <w:r>
-        <w:rPr>
-          <w:sz w:val="20"/>
-          <w:szCs w:val="20"/>
-          <w:lang w:val="en-IN"/>
-        </w:rPr>
-        <w:t> Kenza is speaking. If you interrupt, it instantly stops talking to listen to you.</w:t>
-      </w:r>
-    </w:p>
-    <w:p>
-      <w:pPr>
-        <w:spacing w:line="240" w:lineRule="auto"/>
-        <w:jc w:val="both"/>
-        <w:rPr>
-          <w:b/>
-          <w:bCs/>
-          <w:sz w:val="20"/>
-          <w:szCs w:val="20"/>
-          <w:lang w:val="en-IN"/>
-        </w:rPr>
-      </w:pPr>
-      <w:r>
-        <w:rPr>
-          <w:b/>
-          <w:bCs/>
-          <w:sz w:val="20"/>
-          <w:szCs w:val="20"/>
-          <w:lang w:val="en-IN"/>
-        </w:rPr>
-        <w:t>4. Vision &amp; Perception (Seeing)</w:t>
-      </w:r>
-    </w:p>
-    <w:p>
-      <w:pPr>
-        <w:spacing w:line="240" w:lineRule="auto"/>
-        <w:jc w:val="both"/>
-        <w:rPr>
-          <w:sz w:val="20"/>
-          <w:szCs w:val="20"/>
-          <w:lang w:val="en-IN"/>
-        </w:rPr>
-      </w:pPr>
-      <w:r>
-        <w:rPr>
-          <w:sz w:val="20"/>
-          <w:szCs w:val="20"/>
-          <w:lang w:val="en-IN"/>
-        </w:rPr>
-        <w:lastRenderedPageBreak/>
-        <w:t>Kenza "sees" the world through two main parallel processes:</w:t>
-      </w:r>
-    </w:p>
-    <w:p>
-      <w:pPr>
-        <w:numPr>
-          <w:ilvl w:val="0"/>
-          <w:numId w:val="13"/>
-        </w:numPr>
-        <w:spacing w:line="240" w:lineRule="auto"/>
-        <w:jc w:val="both"/>
-        <w:rPr>
-          <w:sz w:val="20"/>
-          <w:szCs w:val="20"/>
-          <w:lang w:val="en-IN"/>
-        </w:rPr>
-      </w:pPr>
-      <w:r>
-        <w:rPr>
-          <w:b/>
-          <w:bCs/>
-          <w:sz w:val="20"/>
-          <w:szCs w:val="20"/>
-          <w:lang w:val="en-IN"/>
-        </w:rPr>
-        <w:t>Gesture Control (</w:t>
-      </w:r>
-    </w:p>
-    <w:p>
-      <w:pPr>
-        <w:spacing w:line="240" w:lineRule="auto"/>
-        <w:jc w:val="both"/>
-        <w:rPr>
-          <w:sz w:val="20"/>
-          <w:szCs w:val="20"/>
-          <w:lang w:val="en-IN"/>
-        </w:rPr>
-      </w:pPr>
-      <w:r>
-        <w:rPr>
-          <w:sz w:val="20"/>
-          <w:szCs w:val="20"/>
-          <w:lang w:val="en-IN"/>
-        </w:rPr>
-        <w:t>kenza_gesture.py</w:t>
-      </w:r>
-      <w:r>
-        <w:rPr>
-          <w:b/>
-          <w:bCs/>
-          <w:sz w:val="20"/>
-          <w:szCs w:val="20"/>
-          <w:lang w:val="en-IN"/>
-        </w:rPr>
-        <w:t>):</w:t>
-      </w:r>
-    </w:p>
-    <w:p>
-      <w:pPr>
-        <w:numPr>
-          <w:ilvl w:val="1"/>
-          <w:numId w:val="13"/>
-        </w:numPr>
-        <w:spacing w:line="240" w:lineRule="auto"/>
-        <w:jc w:val="both"/>
-        <w:rPr>
-          <w:sz w:val="20"/>
-          <w:szCs w:val="20"/>
-          <w:lang w:val="en-IN"/>
-        </w:rPr>
-      </w:pPr>
-      <w:r>
-        <w:rPr>
-          <w:sz w:val="20"/>
-          <w:szCs w:val="20"/>
-          <w:lang w:val="en-IN"/>
-        </w:rPr>
-        <w:t>It uses </w:t>
-      </w:r>
-      <w:proofErr w:type="spellStart"/>
-      <w:r>
-        <w:rPr>
-          <w:b/>
-          <w:bCs/>
-          <w:sz w:val="20"/>
-          <w:szCs w:val="20"/>
-          <w:lang w:val="en-IN"/>
-        </w:rPr>
-        <w:t>MediaPipe</w:t>
-      </w:r>
-      <w:proofErr w:type="spellEnd"/>
-      <w:r>
-        <w:rPr>
-          <w:b/>
-          <w:bCs/>
-          <w:sz w:val="20"/>
-          <w:szCs w:val="20"/>
-          <w:lang w:val="en-IN"/>
-        </w:rPr>
-        <w:t xml:space="preserve"> Hands</w:t>
-      </w:r>
-      <w:r>
-        <w:rPr>
-          <w:sz w:val="20"/>
-          <w:szCs w:val="20"/>
-          <w:lang w:val="en-IN"/>
-        </w:rPr>
-        <w:t> to track your hand skeletal landmarks in real-time.</w:t>
-      </w:r>
-    </w:p>
-    <w:p>
-      <w:pPr>
-        <w:numPr>
-          <w:ilvl w:val="1"/>
-          <w:numId w:val="13"/>
-        </w:numPr>
-        <w:spacing w:line="240" w:lineRule="auto"/>
-        <w:jc w:val="both"/>
-        <w:rPr>
-          <w:sz w:val="20"/>
-          <w:szCs w:val="20"/>
-          <w:lang w:val="en-IN"/>
-        </w:rPr>
-      </w:pPr>
-      <w:r>
-        <w:rPr>
-          <w:b/>
-          <w:bCs/>
-          <w:sz w:val="20"/>
-          <w:szCs w:val="20"/>
-          <w:lang w:val="en-IN"/>
-        </w:rPr>
-        <w:t>Logic:</w:t>
-      </w:r>
-      <w:r>
-        <w:rPr>
-          <w:sz w:val="20"/>
-          <w:szCs w:val="20"/>
-          <w:lang w:val="en-IN"/>
-        </w:rPr>
-        <w:t> It maps specific hand shapes to actions:</w:t>
-      </w:r>
-    </w:p>
-    <w:p>
-      <w:pPr>
-        <w:numPr>
-          <w:ilvl w:val="2"/>
-          <w:numId w:val="13"/>
-        </w:numPr>
-        <w:spacing w:line="240" w:lineRule="auto"/>
-        <w:jc w:val="both"/>
-        <w:rPr>
-          <w:sz w:val="20"/>
-          <w:szCs w:val="20"/>
-          <w:lang w:val="en-IN"/>
-        </w:rPr>
-      </w:pPr>
-      <w:r>
-        <w:rPr>
-          <w:b/>
-          <w:bCs/>
-          <w:sz w:val="20"/>
-          <w:szCs w:val="20"/>
-          <w:lang w:val="en-IN"/>
-        </w:rPr>
-        <w:t>Pinch:</w:t>
-      </w:r>
-      <w:r>
-        <w:rPr>
-          <w:sz w:val="20"/>
-          <w:szCs w:val="20"/>
-          <w:lang w:val="en-IN"/>
-        </w:rPr>
-        <w:t> Click / Select.</w:t>
-      </w:r>
-    </w:p>
-    <w:p>
-      <w:pPr>
-        <w:numPr>
-          <w:ilvl w:val="2"/>
-          <w:numId w:val="13"/>
-        </w:numPr>
-        <w:spacing w:line="240" w:lineRule="auto"/>
-        <w:jc w:val="both"/>
-        <w:rPr>
-          <w:sz w:val="20"/>
-          <w:szCs w:val="20"/>
-          <w:lang w:val="en-IN"/>
-        </w:rPr>
-      </w:pPr>
-      <w:r>
-        <w:rPr>
-          <w:b/>
-          <w:bCs/>
-          <w:sz w:val="20"/>
-          <w:szCs w:val="20"/>
-          <w:lang w:val="en-IN"/>
-        </w:rPr>
-        <w:t>Closed Fist:</w:t>
-      </w:r>
-      <w:r>
-        <w:rPr>
-          <w:sz w:val="20"/>
-          <w:szCs w:val="20"/>
-          <w:lang w:val="en-IN"/>
-        </w:rPr>
-        <w:t> Drag / Move.</w:t>
-      </w:r>
-    </w:p>
-    <w:p>
-      <w:pPr>
-        <w:numPr>
-          <w:ilvl w:val="2"/>
-          <w:numId w:val="13"/>
-        </w:numPr>
-        <w:spacing w:line="240" w:lineRule="auto"/>
-        <w:jc w:val="both"/>
-        <w:rPr>
-          <w:sz w:val="20"/>
-          <w:szCs w:val="20"/>
-          <w:lang w:val="en-IN"/>
-        </w:rPr>
-      </w:pPr>
-      <w:r>
-        <w:rPr>
-          <w:b/>
-          <w:bCs/>
-          <w:sz w:val="20"/>
-          <w:szCs w:val="20"/>
-          <w:lang w:val="en-IN"/>
-        </w:rPr>
-        <w:t>Pointing:</w:t>
-      </w:r>
-      <w:r>
-        <w:rPr>
-          <w:sz w:val="20"/>
-          <w:szCs w:val="20"/>
-          <w:lang w:val="en-IN"/>
-        </w:rPr>
-        <w:t> Directional control (Up/Down/Left/Right).</w:t>
-      </w:r>
-    </w:p>
-    <w:p>
-      <w:pPr>
-        <w:numPr>
-          <w:ilvl w:val="1"/>
-          <w:numId w:val="13"/>
-        </w:numPr>
-        <w:spacing w:line="240" w:lineRule="auto"/>
-        <w:jc w:val="both"/>
-        <w:rPr>
-          <w:sz w:val="20"/>
-          <w:szCs w:val="20"/>
-          <w:lang w:val="en-IN"/>
-        </w:rPr>
-      </w:pPr>
-      <w:r>
-        <w:rPr>
-          <w:sz w:val="20"/>
-          <w:szCs w:val="20"/>
-          <w:lang w:val="en-IN"/>
-        </w:rPr>
-        <w:t>This allows you to control the Web UI or drive the robot just by waving your hands.</w:t>
-      </w:r>
-    </w:p>
-    <w:p>
-      <w:pPr>
-        <w:numPr>
-          <w:ilvl w:val="0"/>
-          <w:numId w:val="13"/>
-        </w:numPr>
-        <w:spacing w:line="240" w:lineRule="auto"/>
-        <w:jc w:val="both"/>
-        <w:rPr>
-          <w:sz w:val="20"/>
-          <w:szCs w:val="20"/>
-          <w:lang w:val="en-IN"/>
-        </w:rPr>
-      </w:pPr>
-      <w:r>
-        <w:rPr>
-          <w:b/>
-          <w:bCs/>
-          <w:sz w:val="20"/>
-          <w:szCs w:val="20"/>
-          <w:lang w:val="en-IN"/>
-        </w:rPr>
-        <w:t>Face Recognition (</w:t>
-      </w:r>
-    </w:p>
-    <w:p>
-      <w:pPr>
-        <w:spacing w:line="240" w:lineRule="auto"/>
-        <w:jc w:val="both"/>
-        <w:rPr>
-          <w:sz w:val="20"/>
-          <w:szCs w:val="20"/>
-          <w:lang w:val="en-IN"/>
-        </w:rPr>
-      </w:pPr>
-      <w:r>
-        <w:rPr>
-          <w:sz w:val="20"/>
-          <w:szCs w:val="20"/>
-          <w:lang w:val="en-IN"/>
-        </w:rPr>
-        <w:t>kenza_vision.py</w:t>
-      </w:r>
-      <w:r>
-        <w:rPr>
-          <w:b/>
-          <w:bCs/>
-          <w:sz w:val="20"/>
-          <w:szCs w:val="20"/>
-          <w:lang w:val="en-IN"/>
-        </w:rPr>
-        <w:t>):</w:t>
-      </w:r>
-    </w:p>
-    <w:p>
-      <w:pPr>
-        <w:numPr>
-          <w:ilvl w:val="1"/>
-          <w:numId w:val="13"/>
-        </w:numPr>
-        <w:spacing w:line="240" w:lineRule="auto"/>
-        <w:jc w:val="both"/>
-        <w:rPr>
-          <w:sz w:val="20"/>
-          <w:szCs w:val="20"/>
-          <w:lang w:val="en-IN"/>
-        </w:rPr>
-      </w:pPr>
-      <w:r>
-        <w:rPr>
-          <w:sz w:val="20"/>
-          <w:szCs w:val="20"/>
-          <w:lang w:val="en-IN"/>
-        </w:rPr>
-        <w:t>It detects faces and checks them against a database of "known" people (like the owner) using </w:t>
-      </w:r>
-      <w:proofErr w:type="spellStart"/>
-      <w:r>
-        <w:rPr>
-          <w:b/>
-          <w:bCs/>
-          <w:sz w:val="20"/>
-          <w:szCs w:val="20"/>
-          <w:lang w:val="en-IN"/>
-        </w:rPr>
-        <w:t>dlib</w:t>
-      </w:r>
-      <w:proofErr w:type="spellEnd"/>
-      <w:r>
-        <w:rPr>
-          <w:b/>
-          <w:bCs/>
-          <w:sz w:val="20"/>
-          <w:szCs w:val="20"/>
-          <w:lang w:val="en-IN"/>
-        </w:rPr>
-        <w:t>/</w:t>
-      </w:r>
-      <w:proofErr w:type="spellStart"/>
-      <w:r>
-        <w:rPr>
-          <w:b/>
-          <w:bCs/>
-          <w:sz w:val="20"/>
-          <w:szCs w:val="20"/>
-          <w:lang w:val="en-IN"/>
-        </w:rPr>
-        <w:t>face_recognition</w:t>
-      </w:r>
-      <w:proofErr w:type="spellEnd"/>
-      <w:r>
-        <w:rPr>
-          <w:sz w:val="20"/>
-          <w:szCs w:val="20"/>
-          <w:lang w:val="en-IN"/>
-        </w:rPr>
-        <w:t>.</w:t>
-      </w:r>
-    </w:p>
-    <w:p>
-      <w:pPr>
-        <w:numPr>
-          <w:ilvl w:val="1"/>
-          <w:numId w:val="13"/>
-        </w:numPr>
-        <w:spacing w:line="240" w:lineRule="auto"/>
-        <w:jc w:val="both"/>
-        <w:rPr>
-          <w:sz w:val="20"/>
-          <w:szCs w:val="20"/>
-          <w:lang w:val="en-IN"/>
-        </w:rPr>
-      </w:pPr>
-      <w:r>
-        <w:rPr>
-          <w:b/>
-          <w:bCs/>
-          <w:sz w:val="20"/>
-          <w:szCs w:val="20"/>
-          <w:lang w:val="en-IN"/>
-        </w:rPr>
-        <w:t>Function:</w:t>
-      </w:r>
-      <w:r>
-        <w:rPr>
-          <w:sz w:val="20"/>
-          <w:szCs w:val="20"/>
-          <w:lang w:val="en-IN"/>
-        </w:rPr>
-        <w:t> It is used for the "Human Following" mode and to personalize the greetings.</w:t>
-      </w:r>
-    </w:p>
-    <w:p>
-      <w:pPr>
-        <w:spacing w:line="240" w:lineRule="auto"/>
-        <w:jc w:val="both"/>
-        <w:rPr>
-          <w:b/>
-          <w:bCs/>
-          <w:sz w:val="20"/>
-          <w:szCs w:val="20"/>
-          <w:lang w:val="en-IN"/>
-        </w:rPr>
-      </w:pPr>
-      <w:r>
-        <w:rPr>
-          <w:b/>
-          <w:bCs/>
-          <w:sz w:val="20"/>
-          <w:szCs w:val="20"/>
-          <w:lang w:val="en-IN"/>
-        </w:rPr>
-        <w:t>5. Movement &amp; Autonomy (Moving)</w:t>
-      </w:r>
-    </w:p>
-    <w:p>
-      <w:pPr>
-        <w:spacing w:line="240" w:lineRule="auto"/>
-        <w:jc w:val="both"/>
-        <w:rPr>
-          <w:sz w:val="20"/>
-          <w:szCs w:val="20"/>
-          <w:lang w:val="en-IN"/>
-        </w:rPr>
-      </w:pPr>
-      <w:r>
-        <w:rPr>
-          <w:sz w:val="20"/>
-          <w:szCs w:val="20"/>
-          <w:lang w:val="en-IN"/>
-        </w:rPr>
-        <w:t>Movement is handled by </w:t>
-      </w:r>
-    </w:p>
-    <w:p>
-      <w:pPr>
-        <w:spacing w:line="240" w:lineRule="auto"/>
-        <w:jc w:val="both"/>
-        <w:rPr>
-          <w:sz w:val="20"/>
-          <w:szCs w:val="20"/>
-          <w:lang w:val="en-IN"/>
-        </w:rPr>
-      </w:pPr>
-      <w:r>
-        <w:rPr>
-          <w:sz w:val="20"/>
-          <w:szCs w:val="20"/>
-          <w:lang w:val="en-IN"/>
-        </w:rPr>
-        <w:t>kenza_autonomy.py and executed by the </w:t>
-      </w:r>
-    </w:p>
-    <w:p>
-      <w:pPr>
-        <w:spacing w:line="240" w:lineRule="auto"/>
-        <w:jc w:val="both"/>
-        <w:rPr>
-          <w:sz w:val="20"/>
-          <w:szCs w:val="20"/>
-          <w:lang w:val="en-IN"/>
-        </w:rPr>
-      </w:pPr>
-      <w:proofErr w:type="spellStart"/>
-      <w:r>
-        <w:rPr>
-          <w:sz w:val="20"/>
-          <w:szCs w:val="20"/>
-          <w:lang w:val="en-IN"/>
-        </w:rPr>
-        <w:t>GPIOMotorController</w:t>
-      </w:r>
-      <w:proofErr w:type="spellEnd"/>
-      <w:r>
-        <w:rPr>
-          <w:sz w:val="20"/>
-          <w:szCs w:val="20"/>
-          <w:lang w:val="en-IN"/>
-        </w:rPr>
-        <w:t>.</w:t>
-      </w:r>
-    </w:p>
-    <w:p>
-      <w:pPr>
-        <w:numPr>
-          <w:ilvl w:val="0"/>
-          <w:numId w:val="14"/>
-        </w:numPr>
-        <w:spacing w:line="240" w:lineRule="auto"/>
-        <w:jc w:val="both"/>
-        <w:rPr>
-          <w:sz w:val="20"/>
-          <w:szCs w:val="20"/>
-          <w:lang w:val="en-IN"/>
-        </w:rPr>
-      </w:pPr>
-      <w:r>
-        <w:rPr>
-          <w:b/>
-          <w:bCs/>
-          <w:sz w:val="20"/>
-          <w:szCs w:val="20"/>
-          <w:lang w:val="en-IN"/>
-        </w:rPr>
-        <w:t>Manual Control:</w:t>
-      </w:r>
-      <w:r>
-        <w:rPr>
-          <w:sz w:val="20"/>
-          <w:szCs w:val="20"/>
-          <w:lang w:val="en-IN"/>
-        </w:rPr>
-        <w:t> When you use the joystick on the Web App, commands (</w:t>
-      </w:r>
-    </w:p>
-    <w:p>
-      <w:pPr>
-        <w:spacing w:line="240" w:lineRule="auto"/>
-        <w:jc w:val="both"/>
-        <w:rPr>
-          <w:sz w:val="20"/>
-          <w:szCs w:val="20"/>
-          <w:lang w:val="en-IN"/>
-        </w:rPr>
-      </w:pPr>
-      <w:r>
-        <w:rPr>
-          <w:sz w:val="20"/>
-          <w:szCs w:val="20"/>
-          <w:lang w:val="en-IN"/>
-        </w:rPr>
-        <w:t>F</w:t>
-      </w:r>
-    </w:p>
-    <w:p>
-      <w:pPr>
-        <w:spacing w:line="240" w:lineRule="auto"/>
-        <w:jc w:val="both"/>
-        <w:rPr>
-          <w:sz w:val="20"/>
-          <w:szCs w:val="20"/>
-          <w:lang w:val="en-IN"/>
-        </w:rPr>
-      </w:pPr>
-      <w:r>
-        <w:rPr>
-          <w:sz w:val="20"/>
-          <w:szCs w:val="20"/>
-          <w:lang w:val="en-IN"/>
-        </w:rPr>
-        <w:t>, </w:t>
-      </w:r>
-    </w:p>
-    <w:p>
-      <w:pPr>
-        <w:spacing w:line="240" w:lineRule="auto"/>
-        <w:jc w:val="both"/>
-        <w:rPr>
-          <w:sz w:val="20"/>
-          <w:szCs w:val="20"/>
-          <w:lang w:val="en-IN"/>
-        </w:rPr>
-      </w:pPr>
-      <w:r>
-        <w:rPr>
-          <w:sz w:val="20"/>
-          <w:szCs w:val="20"/>
-          <w:lang w:val="en-IN"/>
-        </w:rPr>
-        <w:t>B</w:t>
-      </w:r>
-    </w:p>
-    <w:p>
-      <w:pPr>
-        <w:spacing w:line="240" w:lineRule="auto"/>
-        <w:jc w:val="both"/>
-        <w:rPr>
-          <w:sz w:val="20"/>
-          <w:szCs w:val="20"/>
-          <w:lang w:val="en-IN"/>
-        </w:rPr>
-      </w:pPr>
-      <w:r>
-        <w:rPr>
-          <w:sz w:val="20"/>
-          <w:szCs w:val="20"/>
-          <w:lang w:val="en-IN"/>
-        </w:rPr>
-        <w:t>, </w:t>
-      </w:r>
-    </w:p>
-    <w:p>
-      <w:pPr>
-        <w:spacing w:line="240" w:lineRule="auto"/>
-        <w:jc w:val="both"/>
-        <w:rPr>
-          <w:sz w:val="20"/>
-          <w:szCs w:val="20"/>
-          <w:lang w:val="en-IN"/>
-        </w:rPr>
-      </w:pPr>
-      <w:r>
-        <w:rPr>
-          <w:sz w:val="20"/>
-          <w:szCs w:val="20"/>
-          <w:lang w:val="en-IN"/>
-        </w:rPr>
-        <w:t>L</w:t>
-      </w:r>
-    </w:p>
-    <w:p>
-      <w:pPr>
-        <w:spacing w:line="240" w:lineRule="auto"/>
-        <w:jc w:val="both"/>
-        <w:rPr>
-          <w:sz w:val="20"/>
-          <w:szCs w:val="20"/>
-          <w:lang w:val="en-IN"/>
-        </w:rPr>
-      </w:pPr>
-      <w:r>
-        <w:rPr>
-          <w:sz w:val="20"/>
-          <w:szCs w:val="20"/>
-          <w:lang w:val="en-IN"/>
-        </w:rPr>
-        <w:t>, </w:t>
-      </w:r>
-    </w:p>
-    <w:p>
-      <w:pPr>
-        <w:spacing w:line="240" w:lineRule="auto"/>
-        <w:jc w:val="both"/>
-        <w:rPr>
-          <w:sz w:val="20"/>
-          <w:szCs w:val="20"/>
-          <w:lang w:val="en-IN"/>
-        </w:rPr>
-      </w:pPr>
-      <w:r>
-        <w:rPr>
-          <w:sz w:val="20"/>
-          <w:szCs w:val="20"/>
-          <w:lang w:val="en-IN"/>
-        </w:rPr>
-        <w:t>R</w:t>
-      </w:r>
-    </w:p>
-    <w:p>
-      <w:pPr>
-        <w:spacing w:line="240" w:lineRule="auto"/>
-        <w:jc w:val="both"/>
-        <w:rPr>
-          <w:sz w:val="20"/>
-          <w:szCs w:val="20"/>
-          <w:lang w:val="en-IN"/>
-        </w:rPr>
-      </w:pPr>
-      <w:r>
-        <w:rPr>
-          <w:sz w:val="20"/>
-          <w:szCs w:val="20"/>
-          <w:lang w:val="en-IN"/>
-        </w:rPr>
-        <w:t xml:space="preserve">) </w:t>
-      </w:r>
-      <w:proofErr w:type="gramStart"/>
-      <w:r>
-        <w:rPr>
-          <w:sz w:val="20"/>
-          <w:szCs w:val="20"/>
-          <w:lang w:val="en-IN"/>
-        </w:rPr>
-        <w:t>are</w:t>
-      </w:r>
-      <w:proofErr w:type="gramEnd"/>
-      <w:r>
-        <w:rPr>
-          <w:sz w:val="20"/>
-          <w:szCs w:val="20"/>
-          <w:lang w:val="en-IN"/>
-        </w:rPr>
-        <w:t xml:space="preserve"> sent via WebSocket. The GPIO controller toggles the L298N motor driver pins directly to move the wheels.</w:t>
-      </w:r>
-    </w:p>
-    <w:p>
-      <w:pPr>
-        <w:numPr>
-          <w:ilvl w:val="0"/>
-          <w:numId w:val="14"/>
-        </w:numPr>
-        <w:spacing w:line="240" w:lineRule="auto"/>
-        <w:jc w:val="both"/>
-        <w:rPr>
-          <w:sz w:val="20"/>
-          <w:szCs w:val="20"/>
-          <w:lang w:val="en-IN"/>
-        </w:rPr>
-      </w:pPr>
-      <w:r>
-        <w:rPr>
-          <w:b/>
-          <w:bCs/>
-          <w:sz w:val="20"/>
-          <w:szCs w:val="20"/>
-          <w:lang w:val="en-IN"/>
-        </w:rPr>
-        <w:t>Autonomous Mode:</w:t>
-      </w:r>
-    </w:p>
-    <w:p>
-      <w:pPr>
-        <w:numPr>
-          <w:ilvl w:val="1"/>
-          <w:numId w:val="14"/>
-        </w:numPr>
-        <w:spacing w:line="240" w:lineRule="auto"/>
-        <w:jc w:val="both"/>
-        <w:rPr>
-          <w:sz w:val="20"/>
-          <w:szCs w:val="20"/>
-          <w:lang w:val="en-IN"/>
-        </w:rPr>
-      </w:pPr>
-      <w:r>
-        <w:rPr>
-          <w:b/>
-          <w:bCs/>
-          <w:sz w:val="20"/>
-          <w:szCs w:val="20"/>
-          <w:lang w:val="en-IN"/>
-        </w:rPr>
-        <w:lastRenderedPageBreak/>
-        <w:t>Human Following:</w:t>
-      </w:r>
-      <w:r>
-        <w:rPr>
-          <w:sz w:val="20"/>
-          <w:szCs w:val="20"/>
-          <w:lang w:val="en-IN"/>
-        </w:rPr>
-        <w:t xml:space="preserve"> It locks onto your body pose (using </w:t>
-      </w:r>
-      <w:proofErr w:type="spellStart"/>
-      <w:r>
-        <w:rPr>
-          <w:sz w:val="20"/>
-          <w:szCs w:val="20"/>
-          <w:lang w:val="en-IN"/>
-        </w:rPr>
-        <w:t>MediaPipe</w:t>
-      </w:r>
-      <w:proofErr w:type="spellEnd"/>
-      <w:r>
-        <w:rPr>
-          <w:sz w:val="20"/>
-          <w:szCs w:val="20"/>
-          <w:lang w:val="en-IN"/>
-        </w:rPr>
-        <w:t xml:space="preserve"> Pose). If you move left, it turns left; if you get too far, it drives forward to maintain a set distance.</w:t>
-      </w:r>
-    </w:p>
-    <w:p>
-      <w:pPr>
-        <w:numPr>
-          <w:ilvl w:val="1"/>
-          <w:numId w:val="14"/>
-        </w:numPr>
-        <w:spacing w:line="240" w:lineRule="auto"/>
-        <w:jc w:val="both"/>
-        <w:rPr>
-          <w:sz w:val="20"/>
-          <w:szCs w:val="20"/>
-          <w:lang w:val="en-IN"/>
-        </w:rPr>
-      </w:pPr>
-      <w:r>
-        <w:rPr>
-          <w:b/>
-          <w:bCs/>
-          <w:sz w:val="20"/>
-          <w:szCs w:val="20"/>
-          <w:lang w:val="en-IN"/>
-        </w:rPr>
-        <w:t>Obstacle Avoidance:</w:t>
-      </w:r>
-      <w:r>
-        <w:rPr>
-          <w:sz w:val="20"/>
-          <w:szCs w:val="20"/>
-          <w:lang w:val="en-IN"/>
-        </w:rPr>
-        <w:t> It uses </w:t>
-      </w:r>
-      <w:proofErr w:type="spellStart"/>
-      <w:r>
-        <w:rPr>
-          <w:b/>
-          <w:bCs/>
-          <w:sz w:val="20"/>
-          <w:szCs w:val="20"/>
-          <w:lang w:val="en-IN"/>
-        </w:rPr>
-        <w:t>MobileNet</w:t>
-      </w:r>
-      <w:proofErr w:type="spellEnd"/>
-      <w:r>
-        <w:rPr>
-          <w:b/>
-          <w:bCs/>
-          <w:sz w:val="20"/>
-          <w:szCs w:val="20"/>
-          <w:lang w:val="en-IN"/>
-        </w:rPr>
-        <w:t>-SSD</w:t>
-      </w:r>
-      <w:r>
-        <w:rPr>
-          <w:sz w:val="20"/>
-          <w:szCs w:val="20"/>
-          <w:lang w:val="en-IN"/>
-        </w:rPr>
-        <w:t> (Object Detection) to spot obstacles like chairs or tables. If an object blocks its path, it calculates a "clearest zone" and steers around it automatically.</w:t>
-      </w:r>
-    </w:p>
-    <w:p>
-      <w:pPr>
-        <w:numPr>
-          <w:ilvl w:val="1"/>
-          <w:numId w:val="14"/>
-        </w:numPr>
-        <w:spacing w:line="240" w:lineRule="auto"/>
-        <w:jc w:val="both"/>
-        <w:rPr>
-          <w:sz w:val="20"/>
-          <w:szCs w:val="20"/>
-          <w:lang w:val="en-IN"/>
-        </w:rPr>
-      </w:pPr>
-      <w:r>
-        <w:rPr>
-          <w:b/>
-          <w:bCs/>
-          <w:sz w:val="20"/>
-          <w:szCs w:val="20"/>
-          <w:lang w:val="en-IN"/>
-        </w:rPr>
-        <w:t>Sentry Mode:</w:t>
-      </w:r>
-      <w:r>
-        <w:rPr>
-          <w:sz w:val="20"/>
-          <w:szCs w:val="20"/>
-          <w:lang w:val="en-IN"/>
-        </w:rPr>
-        <w:t> It stays still but monitors the camera for human shapes. If it detects someone, it can send an alert (surveillance).</w:t>
-      </w:r>
-    </w:p>
-    <w:p>
-      <w:pPr>
-        <w:spacing w:line="240" w:lineRule="auto"/>
-        <w:jc w:val="both"/>
-        <w:rPr>
-          <w:b/>
-          <w:bCs/>
-          <w:sz w:val="20"/>
-          <w:szCs w:val="20"/>
-          <w:lang w:val="en-IN"/>
-        </w:rPr>
-      </w:pPr>
-      <w:r>
-        <w:rPr>
-          <w:b/>
-          <w:bCs/>
-          <w:sz w:val="20"/>
-          <w:szCs w:val="20"/>
-          <w:lang w:val="en-IN"/>
-        </w:rPr>
-        <w:t>6. The User Interface (Telepresence)</w:t>
-      </w:r>
-    </w:p>
-    <w:p>
-      <w:pPr>
-        <w:spacing w:line="240" w:lineRule="auto"/>
-        <w:jc w:val="both"/>
-        <w:rPr>
-          <w:sz w:val="20"/>
-          <w:szCs w:val="20"/>
-          <w:lang w:val="en-IN"/>
-        </w:rPr>
-      </w:pPr>
-      <w:r>
-        <w:rPr>
-          <w:sz w:val="20"/>
-          <w:szCs w:val="20"/>
-          <w:lang w:val="en-IN"/>
-        </w:rPr>
-        <w:t>The user interacts via </w:t>
-      </w:r>
-    </w:p>
-    <w:p>
-      <w:pPr>
-        <w:spacing w:line="240" w:lineRule="auto"/>
-        <w:jc w:val="both"/>
-        <w:rPr>
-          <w:sz w:val="20"/>
-          <w:szCs w:val="20"/>
-          <w:lang w:val="en-IN"/>
-        </w:rPr>
-      </w:pPr>
-      <w:r>
-        <w:rPr>
-          <w:sz w:val="20"/>
-          <w:szCs w:val="20"/>
-          <w:lang w:val="en-IN"/>
-        </w:rPr>
-        <w:t>kenza_app_v2.html</w:t>
-      </w:r>
-    </w:p>
-    <w:p>
-      <w:pPr>
-        <w:spacing w:line="240" w:lineRule="auto"/>
-        <w:jc w:val="both"/>
-        <w:rPr>
-          <w:sz w:val="20"/>
-          <w:szCs w:val="20"/>
-          <w:lang w:val="en-IN"/>
-        </w:rPr>
-      </w:pPr>
-      <w:r>
-        <w:rPr>
-          <w:sz w:val="20"/>
-          <w:szCs w:val="20"/>
-          <w:lang w:val="en-IN"/>
-        </w:rPr>
-        <w:t>:</w:t>
-      </w:r>
-    </w:p>
-    <w:p>
-      <w:pPr>
-        <w:numPr>
-          <w:ilvl w:val="0"/>
-          <w:numId w:val="15"/>
-        </w:numPr>
-        <w:spacing w:line="240" w:lineRule="auto"/>
-        <w:jc w:val="both"/>
-        <w:rPr>
-          <w:sz w:val="20"/>
-          <w:szCs w:val="20"/>
-          <w:lang w:val="en-IN"/>
-        </w:rPr>
-      </w:pPr>
-      <w:r>
-        <w:rPr>
-          <w:b/>
-          <w:bCs/>
-          <w:sz w:val="20"/>
-          <w:szCs w:val="20"/>
-          <w:lang w:val="en-IN"/>
-        </w:rPr>
-        <w:t>Live Stream:</w:t>
-      </w:r>
-      <w:r>
-        <w:rPr>
-          <w:sz w:val="20"/>
-          <w:szCs w:val="20"/>
-          <w:lang w:val="en-IN"/>
-        </w:rPr>
-        <w:t> You see what Kenza sees via </w:t>
-      </w:r>
-      <w:r>
-        <w:rPr>
-          <w:b/>
-          <w:bCs/>
-          <w:sz w:val="20"/>
-          <w:szCs w:val="20"/>
-          <w:lang w:val="en-IN"/>
-        </w:rPr>
-        <w:t>WebRTC</w:t>
-      </w:r>
-      <w:r>
-        <w:rPr>
-          <w:sz w:val="20"/>
-          <w:szCs w:val="20"/>
-          <w:lang w:val="en-IN"/>
-        </w:rPr>
-        <w:t> (using </w:t>
-      </w:r>
-    </w:p>
-    <w:p>
-      <w:pPr>
-        <w:spacing w:line="240" w:lineRule="auto"/>
-        <w:jc w:val="both"/>
-        <w:rPr>
-          <w:sz w:val="20"/>
-          <w:szCs w:val="20"/>
-          <w:lang w:val="en-IN"/>
-        </w:rPr>
-      </w:pPr>
-      <w:proofErr w:type="spellStart"/>
-      <w:r>
-        <w:rPr>
-          <w:sz w:val="20"/>
-          <w:szCs w:val="20"/>
-          <w:lang w:val="en-IN"/>
-        </w:rPr>
-        <w:t>aiortc</w:t>
-      </w:r>
-      <w:proofErr w:type="spellEnd"/>
-    </w:p>
-    <w:p>
-      <w:pPr>
-        <w:spacing w:line="240" w:lineRule="auto"/>
-        <w:jc w:val="both"/>
-        <w:rPr>
-          <w:sz w:val="20"/>
-          <w:szCs w:val="20"/>
-          <w:lang w:val="en-IN"/>
-        </w:rPr>
-      </w:pPr>
-      <w:r>
-        <w:rPr>
-          <w:sz w:val="20"/>
-          <w:szCs w:val="20"/>
-          <w:lang w:val="en-IN"/>
-        </w:rPr>
-        <w:t>), which provides ultra-low latency video.</w:t>
-      </w:r>
-    </w:p>
-    <w:p>
-      <w:pPr>
-        <w:numPr>
-          <w:ilvl w:val="0"/>
-          <w:numId w:val="15"/>
-        </w:numPr>
-        <w:spacing w:line="240" w:lineRule="auto"/>
-        <w:jc w:val="both"/>
-        <w:rPr>
-          <w:sz w:val="20"/>
-          <w:szCs w:val="20"/>
-          <w:lang w:val="en-IN"/>
-        </w:rPr>
-      </w:pPr>
-      <w:r>
-        <w:rPr>
-          <w:b/>
-          <w:bCs/>
-          <w:sz w:val="20"/>
-          <w:szCs w:val="20"/>
-          <w:lang w:val="en-IN"/>
-        </w:rPr>
-        <w:t>Echo Cancellation:</w:t>
-      </w:r>
-      <w:r>
-        <w:rPr>
-          <w:sz w:val="20"/>
-          <w:szCs w:val="20"/>
-          <w:lang w:val="en-IN"/>
-        </w:rPr>
-        <w:t> Because the robot has a mic and speaker close together, an AEC (Acoustic Echo Cancellation) filter removes the robot's own voice from the audio feed so you don't hear an echo.</w:t>
-      </w:r>
-    </w:p>
-    <w:p>
-      <w:pPr>
-        <w:numPr>
-          <w:ilvl w:val="0"/>
-          <w:numId w:val="15"/>
-        </w:numPr>
-        <w:spacing w:line="240" w:lineRule="auto"/>
-        <w:jc w:val="both"/>
-        <w:rPr>
-          <w:sz w:val="20"/>
-          <w:szCs w:val="20"/>
-          <w:lang w:val="en-IN"/>
-        </w:rPr>
-      </w:pPr>
-      <w:r>
-        <w:rPr>
-          <w:b/>
-          <w:bCs/>
-          <w:sz w:val="20"/>
-          <w:szCs w:val="20"/>
-          <w:lang w:val="en-IN"/>
-        </w:rPr>
-        <w:t>Controls:</w:t>
-      </w:r>
-      <w:r>
-        <w:rPr>
-          <w:sz w:val="20"/>
-          <w:szCs w:val="20"/>
-          <w:lang w:val="en-IN"/>
-        </w:rPr>
-        <w:t xml:space="preserve"> You can switch modes (Follow, Explore, Remote), change voices, or customize the eye </w:t>
-      </w:r>
-      <w:proofErr w:type="spellStart"/>
-      <w:r>
-        <w:rPr>
-          <w:sz w:val="20"/>
-          <w:szCs w:val="20"/>
-          <w:lang w:val="en-IN"/>
-        </w:rPr>
-        <w:t>color</w:t>
-      </w:r>
-      <w:proofErr w:type="spellEnd"/>
-      <w:r>
-        <w:rPr>
-          <w:sz w:val="20"/>
-          <w:szCs w:val="20"/>
-          <w:lang w:val="en-IN"/>
-        </w:rPr>
-        <w:t>/animations directly from the browser.</w:t>
-      </w:r>
-    </w:p>
-    <w:p>
-      <w:pPr>
-        <w:spacing w:line="240" w:lineRule="auto"/>
-        <w:jc w:val="both"/>
-        <w:rPr>
-          <w:b/>
-          <w:bCs/>
-          <w:sz w:val="20"/>
-          <w:szCs w:val="20"/>
-          <w:lang w:val="en-IN"/>
-        </w:rPr>
-      </w:pPr>
-      <w:r>
-        <w:rPr>
-          <w:b/>
-          <w:bCs/>
-          <w:sz w:val="20"/>
-          <w:szCs w:val="20"/>
-          <w:lang w:val="en-IN"/>
-        </w:rPr>
-        <w:t>Summary Workflow</w:t>
-      </w:r>
-    </w:p>
-    <w:p>
-      <w:pPr>
-        <w:numPr>
-          <w:ilvl w:val="0"/>
-          <w:numId w:val="16"/>
-        </w:numPr>
-        <w:spacing w:line="240" w:lineRule="auto"/>
-        <w:jc w:val="both"/>
-        <w:rPr>
-          <w:sz w:val="20"/>
-          <w:szCs w:val="20"/>
-          <w:lang w:val="en-IN"/>
-        </w:rPr>
-      </w:pPr>
-      <w:r>
-        <w:rPr>
-          <w:b/>
-          <w:bCs/>
-          <w:sz w:val="20"/>
-          <w:szCs w:val="20"/>
-          <w:lang w:val="en-IN"/>
-        </w:rPr>
-        <w:t>Power On</w:t>
-      </w:r>
-      <w:r>
-        <w:rPr>
-          <w:sz w:val="20"/>
-          <w:szCs w:val="20"/>
-          <w:lang w:val="en-IN"/>
-        </w:rPr>
-        <w:t> -&gt; </w:t>
-      </w:r>
-      <w:r>
-        <w:rPr>
-          <w:b/>
-          <w:bCs/>
-          <w:sz w:val="20"/>
-          <w:szCs w:val="20"/>
-          <w:lang w:val="en-IN"/>
-        </w:rPr>
-        <w:t>QR Scan</w:t>
-      </w:r>
-      <w:r>
-        <w:rPr>
-          <w:sz w:val="20"/>
-          <w:szCs w:val="20"/>
-          <w:lang w:val="en-IN"/>
-        </w:rPr>
-        <w:t> -&gt; </w:t>
-      </w:r>
-      <w:r>
-        <w:rPr>
-          <w:b/>
-          <w:bCs/>
-          <w:sz w:val="20"/>
-          <w:szCs w:val="20"/>
-          <w:lang w:val="en-IN"/>
-        </w:rPr>
-        <w:t>Connect Wi-Fi</w:t>
-      </w:r>
-      <w:r>
-        <w:rPr>
-          <w:sz w:val="20"/>
-          <w:szCs w:val="20"/>
-          <w:lang w:val="en-IN"/>
-        </w:rPr>
-        <w:t>.</w:t>
-      </w:r>
-    </w:p>
-    <w:p>
-      <w:pPr>
-        <w:numPr>
-          <w:ilvl w:val="0"/>
-          <w:numId w:val="16"/>
-        </w:numPr>
-        <w:spacing w:line="240" w:lineRule="auto"/>
-        <w:jc w:val="both"/>
-        <w:rPr>
-          <w:sz w:val="20"/>
-          <w:szCs w:val="20"/>
-          <w:lang w:val="en-IN"/>
-        </w:rPr>
-      </w:pPr>
-      <w:r>
-        <w:rPr>
-          <w:b/>
-          <w:bCs/>
-          <w:sz w:val="20"/>
-          <w:szCs w:val="20"/>
-          <w:lang w:val="en-IN"/>
-        </w:rPr>
-        <w:t>User says "Kenza"</w:t>
-      </w:r>
-      <w:r>
-        <w:rPr>
-          <w:sz w:val="20"/>
-          <w:szCs w:val="20"/>
-          <w:lang w:val="en-IN"/>
-        </w:rPr>
-        <w:t> -&gt; </w:t>
-      </w:r>
-      <w:r>
-        <w:rPr>
-          <w:b/>
-          <w:bCs/>
-          <w:sz w:val="20"/>
-          <w:szCs w:val="20"/>
-          <w:lang w:val="en-IN"/>
-        </w:rPr>
-        <w:t>STT</w:t>
-      </w:r>
-      <w:r>
-        <w:rPr>
-          <w:sz w:val="20"/>
-          <w:szCs w:val="20"/>
-          <w:lang w:val="en-IN"/>
-        </w:rPr>
-        <w:t> -&gt; </w:t>
-      </w:r>
-      <w:r>
-        <w:rPr>
-          <w:b/>
-          <w:bCs/>
-          <w:sz w:val="20"/>
-          <w:szCs w:val="20"/>
-          <w:lang w:val="en-IN"/>
-        </w:rPr>
-        <w:t>LLM (Cloud/Local)</w:t>
-      </w:r>
-      <w:r>
-        <w:rPr>
-          <w:sz w:val="20"/>
-          <w:szCs w:val="20"/>
-          <w:lang w:val="en-IN"/>
-        </w:rPr>
-        <w:t> -&gt; </w:t>
-      </w:r>
-      <w:r>
-        <w:rPr>
-          <w:b/>
-          <w:bCs/>
-          <w:sz w:val="20"/>
-          <w:szCs w:val="20"/>
-          <w:lang w:val="en-IN"/>
-        </w:rPr>
-        <w:t>TTS Response</w:t>
-      </w:r>
-      <w:r>
-        <w:rPr>
-          <w:sz w:val="20"/>
-          <w:szCs w:val="20"/>
-          <w:lang w:val="en-IN"/>
-        </w:rPr>
-        <w:t>.</w:t>
-      </w:r>
-    </w:p>
-    <w:p>
-      <w:pPr>
-        <w:numPr>
-          <w:ilvl w:val="0"/>
-          <w:numId w:val="16"/>
-        </w:numPr>
-        <w:spacing w:line="240" w:lineRule="auto"/>
-        <w:jc w:val="both"/>
-        <w:rPr>
-          <w:sz w:val="20"/>
-          <w:szCs w:val="20"/>
-          <w:lang w:val="en-IN"/>
-        </w:rPr>
-      </w:pPr>
-      <w:r>
-        <w:rPr>
-          <w:b/>
-          <w:bCs/>
-          <w:sz w:val="20"/>
-          <w:szCs w:val="20"/>
-          <w:lang w:val="en-IN"/>
-        </w:rPr>
-        <w:t>User sets "Follow Me"</w:t>
-      </w:r>
-      <w:r>
-        <w:rPr>
-          <w:sz w:val="20"/>
-          <w:szCs w:val="20"/>
-          <w:lang w:val="en-IN"/>
-        </w:rPr>
-        <w:t> -&gt; </w:t>
-      </w:r>
-      <w:r>
-        <w:rPr>
-          <w:b/>
-          <w:bCs/>
-          <w:sz w:val="20"/>
-          <w:szCs w:val="20"/>
-          <w:lang w:val="en-IN"/>
-        </w:rPr>
-        <w:t>Vision Tracking</w:t>
-      </w:r>
-      <w:r>
-        <w:rPr>
-          <w:sz w:val="20"/>
-          <w:szCs w:val="20"/>
-          <w:lang w:val="en-IN"/>
-        </w:rPr>
-        <w:t> -&gt; </w:t>
-      </w:r>
-      <w:r>
-        <w:rPr>
-          <w:b/>
-          <w:bCs/>
-          <w:sz w:val="20"/>
-          <w:szCs w:val="20"/>
-          <w:lang w:val="en-IN"/>
-        </w:rPr>
-        <w:t>Motor Control</w:t>
-      </w:r>
-      <w:r>
-        <w:rPr>
-          <w:sz w:val="20"/>
-          <w:szCs w:val="20"/>
-          <w:lang w:val="en-IN"/>
-        </w:rPr>
-        <w:t> (follows user).</w:t>
-      </w:r>
-    </w:p>
-    <w:p>
-      <w:pPr>
-        <w:numPr>
-          <w:ilvl w:val="0"/>
-          <w:numId w:val="16"/>
-        </w:numPr>
-        <w:spacing w:line="240" w:lineRule="auto"/>
-        <w:jc w:val="both"/>
-        <w:rPr>
-          <w:sz w:val="20"/>
-          <w:szCs w:val="20"/>
-          <w:lang w:val="en-IN"/>
-        </w:rPr>
-      </w:pPr>
-      <w:r>
-        <w:rPr>
-          <w:b/>
-          <w:bCs/>
-          <w:sz w:val="20"/>
-          <w:szCs w:val="20"/>
-          <w:lang w:val="en-IN"/>
-        </w:rPr>
-        <w:t>User gestures "Point"</w:t>
-      </w:r>
-      <w:r>
-        <w:rPr>
-          <w:sz w:val="20"/>
-          <w:szCs w:val="20"/>
-          <w:lang w:val="en-IN"/>
-        </w:rPr>
-        <w:t> -&gt; </w:t>
-      </w:r>
-      <w:r>
-        <w:rPr>
-          <w:b/>
-          <w:bCs/>
-          <w:sz w:val="20"/>
-          <w:szCs w:val="20"/>
-          <w:lang w:val="en-IN"/>
-        </w:rPr>
-        <w:t xml:space="preserve">Gesture </w:t>
-      </w:r>
-      <w:proofErr w:type="spellStart"/>
-      <w:r>
-        <w:rPr>
-          <w:b/>
-          <w:bCs/>
-          <w:sz w:val="20"/>
-          <w:szCs w:val="20"/>
-          <w:lang w:val="en-IN"/>
-        </w:rPr>
-        <w:t>Recog</w:t>
-      </w:r>
-      <w:proofErr w:type="spellEnd"/>
-      <w:r>
-        <w:rPr>
-          <w:sz w:val="20"/>
-          <w:szCs w:val="20"/>
-          <w:lang w:val="en-IN"/>
-        </w:rPr>
-        <w:t> -&gt; </w:t>
-      </w:r>
-      <w:r>
-        <w:rPr>
-          <w:b/>
-          <w:bCs/>
-          <w:sz w:val="20"/>
-          <w:szCs w:val="20"/>
-          <w:lang w:val="en-IN"/>
-        </w:rPr>
-        <w:t>Motor Control</w:t>
-      </w:r>
-      <w:r>
-        <w:rPr>
-          <w:sz w:val="20"/>
-          <w:szCs w:val="20"/>
-          <w:lang w:val="en-IN"/>
-        </w:rPr>
-        <w:t> (moves robot)</w:t>
-      </w:r>
-    </w:p>
-    <w:p>
-      <w:pPr>
-        <w:spacing w:line="240" w:lineRule="auto"/>
-        <w:jc w:val="both"/>
-        <w:rPr>
-          <w:sz w:val="20"/>
-          <w:szCs w:val="20"/>
-        </w:rPr>
-      </w:pPr>
     </w:p>
     <w:sectPr>
       <w:pgSz w:w="12240" w:h="15840"/>
@@ -3807,1028 +1212,32 @@
       </w:rPr>
     </w:lvl>
   </w:abstractNum>
-  <w:abstractNum w:abstractNumId="9" w15:restartNumberingAfterBreak="0">
-    <w:nsid w:val="422F44B8"/>
-    <w:multiLevelType w:val="multilevel"/>
-    <w:tmpl w:val="FA7AA760"/>
-    <w:lvl w:ilvl="0">
-      <w:start w:val="1"/>
-      <w:numFmt w:val="bullet"/>
-      <w:lvlText w:val=""/>
-      <w:lvlJc w:val="left"/>
-      <w:pPr>
-        <w:tabs>
-          <w:tab w:val="num" w:pos="720"/>
-        </w:tabs>
-        <w:ind w:left="720" w:hanging="360"/>
-      </w:pPr>
-      <w:rPr>
-        <w:rFonts w:ascii="Symbol" w:hAnsi="Symbol" w:hint="default"/>
-        <w:sz w:val="20"/>
-      </w:rPr>
-    </w:lvl>
-    <w:lvl w:ilvl="1">
-      <w:start w:val="1"/>
-      <w:numFmt w:val="bullet"/>
-      <w:lvlText w:val=""/>
-      <w:lvlJc w:val="left"/>
-      <w:pPr>
-        <w:tabs>
-          <w:tab w:val="num" w:pos="1440"/>
-        </w:tabs>
-        <w:ind w:left="1440" w:hanging="360"/>
-      </w:pPr>
-      <w:rPr>
-        <w:rFonts w:ascii="Symbol" w:hAnsi="Symbol" w:hint="default"/>
-        <w:sz w:val="20"/>
-      </w:rPr>
-    </w:lvl>
-    <w:lvl w:ilvl="2">
-      <w:start w:val="1"/>
-      <w:numFmt w:val="bullet"/>
-      <w:lvlText w:val=""/>
-      <w:lvlJc w:val="left"/>
-      <w:pPr>
-        <w:tabs>
-          <w:tab w:val="num" w:pos="2160"/>
-        </w:tabs>
-        <w:ind w:left="2160" w:hanging="360"/>
-      </w:pPr>
-      <w:rPr>
-        <w:rFonts w:ascii="Symbol" w:hAnsi="Symbol" w:hint="default"/>
-        <w:sz w:val="20"/>
-      </w:rPr>
-    </w:lvl>
-    <w:lvl w:ilvl="3" w:tentative="1">
-      <w:start w:val="1"/>
-      <w:numFmt w:val="bullet"/>
-      <w:lvlText w:val=""/>
-      <w:lvlJc w:val="left"/>
-      <w:pPr>
-        <w:tabs>
-          <w:tab w:val="num" w:pos="2880"/>
-        </w:tabs>
-        <w:ind w:left="2880" w:hanging="360"/>
-      </w:pPr>
-      <w:rPr>
-        <w:rFonts w:ascii="Symbol" w:hAnsi="Symbol" w:hint="default"/>
-        <w:sz w:val="20"/>
-      </w:rPr>
-    </w:lvl>
-    <w:lvl w:ilvl="4" w:tentative="1">
-      <w:start w:val="1"/>
-      <w:numFmt w:val="bullet"/>
-      <w:lvlText w:val=""/>
-      <w:lvlJc w:val="left"/>
-      <w:pPr>
-        <w:tabs>
-          <w:tab w:val="num" w:pos="3600"/>
-        </w:tabs>
-        <w:ind w:left="3600" w:hanging="360"/>
-      </w:pPr>
-      <w:rPr>
-        <w:rFonts w:ascii="Symbol" w:hAnsi="Symbol" w:hint="default"/>
-        <w:sz w:val="20"/>
-      </w:rPr>
-    </w:lvl>
-    <w:lvl w:ilvl="5" w:tentative="1">
-      <w:start w:val="1"/>
-      <w:numFmt w:val="bullet"/>
-      <w:lvlText w:val=""/>
-      <w:lvlJc w:val="left"/>
-      <w:pPr>
-        <w:tabs>
-          <w:tab w:val="num" w:pos="4320"/>
-        </w:tabs>
-        <w:ind w:left="4320" w:hanging="360"/>
-      </w:pPr>
-      <w:rPr>
-        <w:rFonts w:ascii="Symbol" w:hAnsi="Symbol" w:hint="default"/>
-        <w:sz w:val="20"/>
-      </w:rPr>
-    </w:lvl>
-    <w:lvl w:ilvl="6" w:tentative="1">
-      <w:start w:val="1"/>
-      <w:numFmt w:val="bullet"/>
-      <w:lvlText w:val=""/>
-      <w:lvlJc w:val="left"/>
-      <w:pPr>
-        <w:tabs>
-          <w:tab w:val="num" w:pos="5040"/>
-        </w:tabs>
-        <w:ind w:left="5040" w:hanging="360"/>
-      </w:pPr>
-      <w:rPr>
-        <w:rFonts w:ascii="Symbol" w:hAnsi="Symbol" w:hint="default"/>
-        <w:sz w:val="20"/>
-      </w:rPr>
-    </w:lvl>
-    <w:lvl w:ilvl="7" w:tentative="1">
-      <w:start w:val="1"/>
-      <w:numFmt w:val="bullet"/>
-      <w:lvlText w:val=""/>
-      <w:lvlJc w:val="left"/>
-      <w:pPr>
-        <w:tabs>
-          <w:tab w:val="num" w:pos="5760"/>
-        </w:tabs>
-        <w:ind w:left="5760" w:hanging="360"/>
-      </w:pPr>
-      <w:rPr>
-        <w:rFonts w:ascii="Symbol" w:hAnsi="Symbol" w:hint="default"/>
-        <w:sz w:val="20"/>
-      </w:rPr>
-    </w:lvl>
-    <w:lvl w:ilvl="8" w:tentative="1">
-      <w:start w:val="1"/>
-      <w:numFmt w:val="bullet"/>
-      <w:lvlText w:val=""/>
-      <w:lvlJc w:val="left"/>
-      <w:pPr>
-        <w:tabs>
-          <w:tab w:val="num" w:pos="6480"/>
-        </w:tabs>
-        <w:ind w:left="6480" w:hanging="360"/>
-      </w:pPr>
-      <w:rPr>
-        <w:rFonts w:ascii="Symbol" w:hAnsi="Symbol" w:hint="default"/>
-        <w:sz w:val="20"/>
-      </w:rPr>
-    </w:lvl>
-  </w:abstractNum>
-  <w:abstractNum w:abstractNumId="10" w15:restartNumberingAfterBreak="0">
-    <w:nsid w:val="42EC1046"/>
-    <w:multiLevelType w:val="multilevel"/>
-    <w:tmpl w:val="21E81DFE"/>
-    <w:lvl w:ilvl="0">
-      <w:start w:val="1"/>
-      <w:numFmt w:val="decimal"/>
-      <w:lvlText w:val="%1."/>
-      <w:lvlJc w:val="left"/>
-      <w:pPr>
-        <w:tabs>
-          <w:tab w:val="num" w:pos="720"/>
-        </w:tabs>
-        <w:ind w:left="720" w:hanging="360"/>
-      </w:pPr>
-    </w:lvl>
-    <w:lvl w:ilvl="1" w:tentative="1">
-      <w:start w:val="1"/>
-      <w:numFmt w:val="decimal"/>
-      <w:lvlText w:val="%2."/>
-      <w:lvlJc w:val="left"/>
-      <w:pPr>
-        <w:tabs>
-          <w:tab w:val="num" w:pos="1440"/>
-        </w:tabs>
-        <w:ind w:left="1440" w:hanging="360"/>
-      </w:pPr>
-    </w:lvl>
-    <w:lvl w:ilvl="2" w:tentative="1">
-      <w:start w:val="1"/>
-      <w:numFmt w:val="decimal"/>
-      <w:lvlText w:val="%3."/>
-      <w:lvlJc w:val="left"/>
-      <w:pPr>
-        <w:tabs>
-          <w:tab w:val="num" w:pos="2160"/>
-        </w:tabs>
-        <w:ind w:left="2160" w:hanging="360"/>
-      </w:pPr>
-    </w:lvl>
-    <w:lvl w:ilvl="3" w:tentative="1">
-      <w:start w:val="1"/>
-      <w:numFmt w:val="decimal"/>
-      <w:lvlText w:val="%4."/>
-      <w:lvlJc w:val="left"/>
-      <w:pPr>
-        <w:tabs>
-          <w:tab w:val="num" w:pos="2880"/>
-        </w:tabs>
-        <w:ind w:left="2880" w:hanging="360"/>
-      </w:pPr>
-    </w:lvl>
-    <w:lvl w:ilvl="4" w:tentative="1">
-      <w:start w:val="1"/>
-      <w:numFmt w:val="decimal"/>
-      <w:lvlText w:val="%5."/>
-      <w:lvlJc w:val="left"/>
-      <w:pPr>
-        <w:tabs>
-          <w:tab w:val="num" w:pos="3600"/>
-        </w:tabs>
-        <w:ind w:left="3600" w:hanging="360"/>
-      </w:pPr>
-    </w:lvl>
-    <w:lvl w:ilvl="5" w:tentative="1">
-      <w:start w:val="1"/>
-      <w:numFmt w:val="decimal"/>
-      <w:lvlText w:val="%6."/>
-      <w:lvlJc w:val="left"/>
-      <w:pPr>
-        <w:tabs>
-          <w:tab w:val="num" w:pos="4320"/>
-        </w:tabs>
-        <w:ind w:left="4320" w:hanging="360"/>
-      </w:pPr>
-    </w:lvl>
-    <w:lvl w:ilvl="6" w:tentative="1">
-      <w:start w:val="1"/>
-      <w:numFmt w:val="decimal"/>
-      <w:lvlText w:val="%7."/>
-      <w:lvlJc w:val="left"/>
-      <w:pPr>
-        <w:tabs>
-          <w:tab w:val="num" w:pos="5040"/>
-        </w:tabs>
-        <w:ind w:left="5040" w:hanging="360"/>
-      </w:pPr>
-    </w:lvl>
-    <w:lvl w:ilvl="7" w:tentative="1">
-      <w:start w:val="1"/>
-      <w:numFmt w:val="decimal"/>
-      <w:lvlText w:val="%8."/>
-      <w:lvlJc w:val="left"/>
-      <w:pPr>
-        <w:tabs>
-          <w:tab w:val="num" w:pos="5760"/>
-        </w:tabs>
-        <w:ind w:left="5760" w:hanging="360"/>
-      </w:pPr>
-    </w:lvl>
-    <w:lvl w:ilvl="8" w:tentative="1">
-      <w:start w:val="1"/>
-      <w:numFmt w:val="decimal"/>
-      <w:lvlText w:val="%9."/>
-      <w:lvlJc w:val="left"/>
-      <w:pPr>
-        <w:tabs>
-          <w:tab w:val="num" w:pos="6480"/>
-        </w:tabs>
-        <w:ind w:left="6480" w:hanging="360"/>
-      </w:pPr>
-    </w:lvl>
-  </w:abstractNum>
-  <w:abstractNum w:abstractNumId="11" w15:restartNumberingAfterBreak="0">
-    <w:nsid w:val="4BAB1DA6"/>
-    <w:multiLevelType w:val="multilevel"/>
-    <w:tmpl w:val="6472FA66"/>
-    <w:lvl w:ilvl="0">
-      <w:start w:val="1"/>
-      <w:numFmt w:val="bullet"/>
-      <w:lvlText w:val=""/>
-      <w:lvlJc w:val="left"/>
-      <w:pPr>
-        <w:tabs>
-          <w:tab w:val="num" w:pos="720"/>
-        </w:tabs>
-        <w:ind w:left="720" w:hanging="360"/>
-      </w:pPr>
-      <w:rPr>
-        <w:rFonts w:ascii="Symbol" w:hAnsi="Symbol" w:hint="default"/>
-        <w:sz w:val="20"/>
-      </w:rPr>
-    </w:lvl>
-    <w:lvl w:ilvl="1" w:tentative="1">
-      <w:start w:val="1"/>
-      <w:numFmt w:val="bullet"/>
-      <w:lvlText w:val=""/>
-      <w:lvlJc w:val="left"/>
-      <w:pPr>
-        <w:tabs>
-          <w:tab w:val="num" w:pos="1440"/>
-        </w:tabs>
-        <w:ind w:left="1440" w:hanging="360"/>
-      </w:pPr>
-      <w:rPr>
-        <w:rFonts w:ascii="Symbol" w:hAnsi="Symbol" w:hint="default"/>
-        <w:sz w:val="20"/>
-      </w:rPr>
-    </w:lvl>
-    <w:lvl w:ilvl="2" w:tentative="1">
-      <w:start w:val="1"/>
-      <w:numFmt w:val="bullet"/>
-      <w:lvlText w:val=""/>
-      <w:lvlJc w:val="left"/>
-      <w:pPr>
-        <w:tabs>
-          <w:tab w:val="num" w:pos="2160"/>
-        </w:tabs>
-        <w:ind w:left="2160" w:hanging="360"/>
-      </w:pPr>
-      <w:rPr>
-        <w:rFonts w:ascii="Symbol" w:hAnsi="Symbol" w:hint="default"/>
-        <w:sz w:val="20"/>
-      </w:rPr>
-    </w:lvl>
-    <w:lvl w:ilvl="3" w:tentative="1">
-      <w:start w:val="1"/>
-      <w:numFmt w:val="bullet"/>
-      <w:lvlText w:val=""/>
-      <w:lvlJc w:val="left"/>
-      <w:pPr>
-        <w:tabs>
-          <w:tab w:val="num" w:pos="2880"/>
-        </w:tabs>
-        <w:ind w:left="2880" w:hanging="360"/>
-      </w:pPr>
-      <w:rPr>
-        <w:rFonts w:ascii="Symbol" w:hAnsi="Symbol" w:hint="default"/>
-        <w:sz w:val="20"/>
-      </w:rPr>
-    </w:lvl>
-    <w:lvl w:ilvl="4" w:tentative="1">
-      <w:start w:val="1"/>
-      <w:numFmt w:val="bullet"/>
-      <w:lvlText w:val=""/>
-      <w:lvlJc w:val="left"/>
-      <w:pPr>
-        <w:tabs>
-          <w:tab w:val="num" w:pos="3600"/>
-        </w:tabs>
-        <w:ind w:left="3600" w:hanging="360"/>
-      </w:pPr>
-      <w:rPr>
-        <w:rFonts w:ascii="Symbol" w:hAnsi="Symbol" w:hint="default"/>
-        <w:sz w:val="20"/>
-      </w:rPr>
-    </w:lvl>
-    <w:lvl w:ilvl="5" w:tentative="1">
-      <w:start w:val="1"/>
-      <w:numFmt w:val="bullet"/>
-      <w:lvlText w:val=""/>
-      <w:lvlJc w:val="left"/>
-      <w:pPr>
-        <w:tabs>
-          <w:tab w:val="num" w:pos="4320"/>
-        </w:tabs>
-        <w:ind w:left="4320" w:hanging="360"/>
-      </w:pPr>
-      <w:rPr>
-        <w:rFonts w:ascii="Symbol" w:hAnsi="Symbol" w:hint="default"/>
-        <w:sz w:val="20"/>
-      </w:rPr>
-    </w:lvl>
-    <w:lvl w:ilvl="6" w:tentative="1">
-      <w:start w:val="1"/>
-      <w:numFmt w:val="bullet"/>
-      <w:lvlText w:val=""/>
-      <w:lvlJc w:val="left"/>
-      <w:pPr>
-        <w:tabs>
-          <w:tab w:val="num" w:pos="5040"/>
-        </w:tabs>
-        <w:ind w:left="5040" w:hanging="360"/>
-      </w:pPr>
-      <w:rPr>
-        <w:rFonts w:ascii="Symbol" w:hAnsi="Symbol" w:hint="default"/>
-        <w:sz w:val="20"/>
-      </w:rPr>
-    </w:lvl>
-    <w:lvl w:ilvl="7" w:tentative="1">
-      <w:start w:val="1"/>
-      <w:numFmt w:val="bullet"/>
-      <w:lvlText w:val=""/>
-      <w:lvlJc w:val="left"/>
-      <w:pPr>
-        <w:tabs>
-          <w:tab w:val="num" w:pos="5760"/>
-        </w:tabs>
-        <w:ind w:left="5760" w:hanging="360"/>
-      </w:pPr>
-      <w:rPr>
-        <w:rFonts w:ascii="Symbol" w:hAnsi="Symbol" w:hint="default"/>
-        <w:sz w:val="20"/>
-      </w:rPr>
-    </w:lvl>
-    <w:lvl w:ilvl="8" w:tentative="1">
-      <w:start w:val="1"/>
-      <w:numFmt w:val="bullet"/>
-      <w:lvlText w:val=""/>
-      <w:lvlJc w:val="left"/>
-      <w:pPr>
-        <w:tabs>
-          <w:tab w:val="num" w:pos="6480"/>
-        </w:tabs>
-        <w:ind w:left="6480" w:hanging="360"/>
-      </w:pPr>
-      <w:rPr>
-        <w:rFonts w:ascii="Symbol" w:hAnsi="Symbol" w:hint="default"/>
-        <w:sz w:val="20"/>
-      </w:rPr>
-    </w:lvl>
-  </w:abstractNum>
-  <w:abstractNum w:abstractNumId="12" w15:restartNumberingAfterBreak="0">
-    <w:nsid w:val="53552FB0"/>
-    <w:multiLevelType w:val="multilevel"/>
-    <w:tmpl w:val="670CAADE"/>
-    <w:lvl w:ilvl="0">
-      <w:start w:val="1"/>
-      <w:numFmt w:val="bullet"/>
-      <w:lvlText w:val=""/>
-      <w:lvlJc w:val="left"/>
-      <w:pPr>
-        <w:tabs>
-          <w:tab w:val="num" w:pos="720"/>
-        </w:tabs>
-        <w:ind w:left="720" w:hanging="360"/>
-      </w:pPr>
-      <w:rPr>
-        <w:rFonts w:ascii="Symbol" w:hAnsi="Symbol" w:hint="default"/>
-        <w:sz w:val="20"/>
-      </w:rPr>
-    </w:lvl>
-    <w:lvl w:ilvl="1">
-      <w:start w:val="1"/>
-      <w:numFmt w:val="bullet"/>
-      <w:lvlText w:val=""/>
-      <w:lvlJc w:val="left"/>
-      <w:pPr>
-        <w:tabs>
-          <w:tab w:val="num" w:pos="1440"/>
-        </w:tabs>
-        <w:ind w:left="1440" w:hanging="360"/>
-      </w:pPr>
-      <w:rPr>
-        <w:rFonts w:ascii="Symbol" w:hAnsi="Symbol" w:hint="default"/>
-        <w:sz w:val="20"/>
-      </w:rPr>
-    </w:lvl>
-    <w:lvl w:ilvl="2" w:tentative="1">
-      <w:start w:val="1"/>
-      <w:numFmt w:val="bullet"/>
-      <w:lvlText w:val=""/>
-      <w:lvlJc w:val="left"/>
-      <w:pPr>
-        <w:tabs>
-          <w:tab w:val="num" w:pos="2160"/>
-        </w:tabs>
-        <w:ind w:left="2160" w:hanging="360"/>
-      </w:pPr>
-      <w:rPr>
-        <w:rFonts w:ascii="Symbol" w:hAnsi="Symbol" w:hint="default"/>
-        <w:sz w:val="20"/>
-      </w:rPr>
-    </w:lvl>
-    <w:lvl w:ilvl="3" w:tentative="1">
-      <w:start w:val="1"/>
-      <w:numFmt w:val="bullet"/>
-      <w:lvlText w:val=""/>
-      <w:lvlJc w:val="left"/>
-      <w:pPr>
-        <w:tabs>
-          <w:tab w:val="num" w:pos="2880"/>
-        </w:tabs>
-        <w:ind w:left="2880" w:hanging="360"/>
-      </w:pPr>
-      <w:rPr>
-        <w:rFonts w:ascii="Symbol" w:hAnsi="Symbol" w:hint="default"/>
-        <w:sz w:val="20"/>
-      </w:rPr>
-    </w:lvl>
-    <w:lvl w:ilvl="4" w:tentative="1">
-      <w:start w:val="1"/>
-      <w:numFmt w:val="bullet"/>
-      <w:lvlText w:val=""/>
-      <w:lvlJc w:val="left"/>
-      <w:pPr>
-        <w:tabs>
-          <w:tab w:val="num" w:pos="3600"/>
-        </w:tabs>
-        <w:ind w:left="3600" w:hanging="360"/>
-      </w:pPr>
-      <w:rPr>
-        <w:rFonts w:ascii="Symbol" w:hAnsi="Symbol" w:hint="default"/>
-        <w:sz w:val="20"/>
-      </w:rPr>
-    </w:lvl>
-    <w:lvl w:ilvl="5" w:tentative="1">
-      <w:start w:val="1"/>
-      <w:numFmt w:val="bullet"/>
-      <w:lvlText w:val=""/>
-      <w:lvlJc w:val="left"/>
-      <w:pPr>
-        <w:tabs>
-          <w:tab w:val="num" w:pos="4320"/>
-        </w:tabs>
-        <w:ind w:left="4320" w:hanging="360"/>
-      </w:pPr>
-      <w:rPr>
-        <w:rFonts w:ascii="Symbol" w:hAnsi="Symbol" w:hint="default"/>
-        <w:sz w:val="20"/>
-      </w:rPr>
-    </w:lvl>
-    <w:lvl w:ilvl="6" w:tentative="1">
-      <w:start w:val="1"/>
-      <w:numFmt w:val="bullet"/>
-      <w:lvlText w:val=""/>
-      <w:lvlJc w:val="left"/>
-      <w:pPr>
-        <w:tabs>
-          <w:tab w:val="num" w:pos="5040"/>
-        </w:tabs>
-        <w:ind w:left="5040" w:hanging="360"/>
-      </w:pPr>
-      <w:rPr>
-        <w:rFonts w:ascii="Symbol" w:hAnsi="Symbol" w:hint="default"/>
-        <w:sz w:val="20"/>
-      </w:rPr>
-    </w:lvl>
-    <w:lvl w:ilvl="7" w:tentative="1">
-      <w:start w:val="1"/>
-      <w:numFmt w:val="bullet"/>
-      <w:lvlText w:val=""/>
-      <w:lvlJc w:val="left"/>
-      <w:pPr>
-        <w:tabs>
-          <w:tab w:val="num" w:pos="5760"/>
-        </w:tabs>
-        <w:ind w:left="5760" w:hanging="360"/>
-      </w:pPr>
-      <w:rPr>
-        <w:rFonts w:ascii="Symbol" w:hAnsi="Symbol" w:hint="default"/>
-        <w:sz w:val="20"/>
-      </w:rPr>
-    </w:lvl>
-    <w:lvl w:ilvl="8" w:tentative="1">
-      <w:start w:val="1"/>
-      <w:numFmt w:val="bullet"/>
-      <w:lvlText w:val=""/>
-      <w:lvlJc w:val="left"/>
-      <w:pPr>
-        <w:tabs>
-          <w:tab w:val="num" w:pos="6480"/>
-        </w:tabs>
-        <w:ind w:left="6480" w:hanging="360"/>
-      </w:pPr>
-      <w:rPr>
-        <w:rFonts w:ascii="Symbol" w:hAnsi="Symbol" w:hint="default"/>
-        <w:sz w:val="20"/>
-      </w:rPr>
-    </w:lvl>
-  </w:abstractNum>
-  <w:abstractNum w:abstractNumId="13" w15:restartNumberingAfterBreak="0">
-    <w:nsid w:val="64266471"/>
-    <w:multiLevelType w:val="multilevel"/>
-    <w:tmpl w:val="05BC5310"/>
-    <w:lvl w:ilvl="0">
-      <w:start w:val="1"/>
-      <w:numFmt w:val="decimal"/>
-      <w:lvlText w:val="%1."/>
-      <w:lvlJc w:val="left"/>
-      <w:pPr>
-        <w:tabs>
-          <w:tab w:val="num" w:pos="720"/>
-        </w:tabs>
-        <w:ind w:left="720" w:hanging="360"/>
-      </w:pPr>
-    </w:lvl>
-    <w:lvl w:ilvl="1">
-      <w:start w:val="1"/>
-      <w:numFmt w:val="bullet"/>
-      <w:lvlText w:val=""/>
-      <w:lvlJc w:val="left"/>
-      <w:pPr>
-        <w:tabs>
-          <w:tab w:val="num" w:pos="1440"/>
-        </w:tabs>
-        <w:ind w:left="1440" w:hanging="360"/>
-      </w:pPr>
-      <w:rPr>
-        <w:rFonts w:ascii="Symbol" w:hAnsi="Symbol" w:hint="default"/>
-        <w:sz w:val="20"/>
-      </w:rPr>
-    </w:lvl>
-    <w:lvl w:ilvl="2" w:tentative="1">
-      <w:start w:val="1"/>
-      <w:numFmt w:val="decimal"/>
-      <w:lvlText w:val="%3."/>
-      <w:lvlJc w:val="left"/>
-      <w:pPr>
-        <w:tabs>
-          <w:tab w:val="num" w:pos="2160"/>
-        </w:tabs>
-        <w:ind w:left="2160" w:hanging="360"/>
-      </w:pPr>
-    </w:lvl>
-    <w:lvl w:ilvl="3" w:tentative="1">
-      <w:start w:val="1"/>
-      <w:numFmt w:val="decimal"/>
-      <w:lvlText w:val="%4."/>
-      <w:lvlJc w:val="left"/>
-      <w:pPr>
-        <w:tabs>
-          <w:tab w:val="num" w:pos="2880"/>
-        </w:tabs>
-        <w:ind w:left="2880" w:hanging="360"/>
-      </w:pPr>
-    </w:lvl>
-    <w:lvl w:ilvl="4" w:tentative="1">
-      <w:start w:val="1"/>
-      <w:numFmt w:val="decimal"/>
-      <w:lvlText w:val="%5."/>
-      <w:lvlJc w:val="left"/>
-      <w:pPr>
-        <w:tabs>
-          <w:tab w:val="num" w:pos="3600"/>
-        </w:tabs>
-        <w:ind w:left="3600" w:hanging="360"/>
-      </w:pPr>
-    </w:lvl>
-    <w:lvl w:ilvl="5" w:tentative="1">
-      <w:start w:val="1"/>
-      <w:numFmt w:val="decimal"/>
-      <w:lvlText w:val="%6."/>
-      <w:lvlJc w:val="left"/>
-      <w:pPr>
-        <w:tabs>
-          <w:tab w:val="num" w:pos="4320"/>
-        </w:tabs>
-        <w:ind w:left="4320" w:hanging="360"/>
-      </w:pPr>
-    </w:lvl>
-    <w:lvl w:ilvl="6" w:tentative="1">
-      <w:start w:val="1"/>
-      <w:numFmt w:val="decimal"/>
-      <w:lvlText w:val="%7."/>
-      <w:lvlJc w:val="left"/>
-      <w:pPr>
-        <w:tabs>
-          <w:tab w:val="num" w:pos="5040"/>
-        </w:tabs>
-        <w:ind w:left="5040" w:hanging="360"/>
-      </w:pPr>
-    </w:lvl>
-    <w:lvl w:ilvl="7" w:tentative="1">
-      <w:start w:val="1"/>
-      <w:numFmt w:val="decimal"/>
-      <w:lvlText w:val="%8."/>
-      <w:lvlJc w:val="left"/>
-      <w:pPr>
-        <w:tabs>
-          <w:tab w:val="num" w:pos="5760"/>
-        </w:tabs>
-        <w:ind w:left="5760" w:hanging="360"/>
-      </w:pPr>
-    </w:lvl>
-    <w:lvl w:ilvl="8" w:tentative="1">
-      <w:start w:val="1"/>
-      <w:numFmt w:val="decimal"/>
-      <w:lvlText w:val="%9."/>
-      <w:lvlJc w:val="left"/>
-      <w:pPr>
-        <w:tabs>
-          <w:tab w:val="num" w:pos="6480"/>
-        </w:tabs>
-        <w:ind w:left="6480" w:hanging="360"/>
-      </w:pPr>
-    </w:lvl>
-  </w:abstractNum>
-  <w:abstractNum w:abstractNumId="14" w15:restartNumberingAfterBreak="0">
-    <w:nsid w:val="693B4A68"/>
-    <w:multiLevelType w:val="multilevel"/>
-    <w:tmpl w:val="8BEA1B78"/>
-    <w:lvl w:ilvl="0">
-      <w:start w:val="1"/>
-      <w:numFmt w:val="bullet"/>
-      <w:lvlText w:val=""/>
-      <w:lvlJc w:val="left"/>
-      <w:pPr>
-        <w:tabs>
-          <w:tab w:val="num" w:pos="720"/>
-        </w:tabs>
-        <w:ind w:left="720" w:hanging="360"/>
-      </w:pPr>
-      <w:rPr>
-        <w:rFonts w:ascii="Symbol" w:hAnsi="Symbol" w:hint="default"/>
-        <w:sz w:val="20"/>
-      </w:rPr>
-    </w:lvl>
-    <w:lvl w:ilvl="1">
-      <w:start w:val="1"/>
-      <w:numFmt w:val="bullet"/>
-      <w:lvlText w:val=""/>
-      <w:lvlJc w:val="left"/>
-      <w:pPr>
-        <w:tabs>
-          <w:tab w:val="num" w:pos="1440"/>
-        </w:tabs>
-        <w:ind w:left="1440" w:hanging="360"/>
-      </w:pPr>
-      <w:rPr>
-        <w:rFonts w:ascii="Symbol" w:hAnsi="Symbol" w:hint="default"/>
-        <w:sz w:val="20"/>
-      </w:rPr>
-    </w:lvl>
-    <w:lvl w:ilvl="2" w:tentative="1">
-      <w:start w:val="1"/>
-      <w:numFmt w:val="bullet"/>
-      <w:lvlText w:val=""/>
-      <w:lvlJc w:val="left"/>
-      <w:pPr>
-        <w:tabs>
-          <w:tab w:val="num" w:pos="2160"/>
-        </w:tabs>
-        <w:ind w:left="2160" w:hanging="360"/>
-      </w:pPr>
-      <w:rPr>
-        <w:rFonts w:ascii="Symbol" w:hAnsi="Symbol" w:hint="default"/>
-        <w:sz w:val="20"/>
-      </w:rPr>
-    </w:lvl>
-    <w:lvl w:ilvl="3" w:tentative="1">
-      <w:start w:val="1"/>
-      <w:numFmt w:val="bullet"/>
-      <w:lvlText w:val=""/>
-      <w:lvlJc w:val="left"/>
-      <w:pPr>
-        <w:tabs>
-          <w:tab w:val="num" w:pos="2880"/>
-        </w:tabs>
-        <w:ind w:left="2880" w:hanging="360"/>
-      </w:pPr>
-      <w:rPr>
-        <w:rFonts w:ascii="Symbol" w:hAnsi="Symbol" w:hint="default"/>
-        <w:sz w:val="20"/>
-      </w:rPr>
-    </w:lvl>
-    <w:lvl w:ilvl="4" w:tentative="1">
-      <w:start w:val="1"/>
-      <w:numFmt w:val="bullet"/>
-      <w:lvlText w:val=""/>
-      <w:lvlJc w:val="left"/>
-      <w:pPr>
-        <w:tabs>
-          <w:tab w:val="num" w:pos="3600"/>
-        </w:tabs>
-        <w:ind w:left="3600" w:hanging="360"/>
-      </w:pPr>
-      <w:rPr>
-        <w:rFonts w:ascii="Symbol" w:hAnsi="Symbol" w:hint="default"/>
-        <w:sz w:val="20"/>
-      </w:rPr>
-    </w:lvl>
-    <w:lvl w:ilvl="5" w:tentative="1">
-      <w:start w:val="1"/>
-      <w:numFmt w:val="bullet"/>
-      <w:lvlText w:val=""/>
-      <w:lvlJc w:val="left"/>
-      <w:pPr>
-        <w:tabs>
-          <w:tab w:val="num" w:pos="4320"/>
-        </w:tabs>
-        <w:ind w:left="4320" w:hanging="360"/>
-      </w:pPr>
-      <w:rPr>
-        <w:rFonts w:ascii="Symbol" w:hAnsi="Symbol" w:hint="default"/>
-        <w:sz w:val="20"/>
-      </w:rPr>
-    </w:lvl>
-    <w:lvl w:ilvl="6" w:tentative="1">
-      <w:start w:val="1"/>
-      <w:numFmt w:val="bullet"/>
-      <w:lvlText w:val=""/>
-      <w:lvlJc w:val="left"/>
-      <w:pPr>
-        <w:tabs>
-          <w:tab w:val="num" w:pos="5040"/>
-        </w:tabs>
-        <w:ind w:left="5040" w:hanging="360"/>
-      </w:pPr>
-      <w:rPr>
-        <w:rFonts w:ascii="Symbol" w:hAnsi="Symbol" w:hint="default"/>
-        <w:sz w:val="20"/>
-      </w:rPr>
-    </w:lvl>
-    <w:lvl w:ilvl="7" w:tentative="1">
-      <w:start w:val="1"/>
-      <w:numFmt w:val="bullet"/>
-      <w:lvlText w:val=""/>
-      <w:lvlJc w:val="left"/>
-      <w:pPr>
-        <w:tabs>
-          <w:tab w:val="num" w:pos="5760"/>
-        </w:tabs>
-        <w:ind w:left="5760" w:hanging="360"/>
-      </w:pPr>
-      <w:rPr>
-        <w:rFonts w:ascii="Symbol" w:hAnsi="Symbol" w:hint="default"/>
-        <w:sz w:val="20"/>
-      </w:rPr>
-    </w:lvl>
-    <w:lvl w:ilvl="8" w:tentative="1">
-      <w:start w:val="1"/>
-      <w:numFmt w:val="bullet"/>
-      <w:lvlText w:val=""/>
-      <w:lvlJc w:val="left"/>
-      <w:pPr>
-        <w:tabs>
-          <w:tab w:val="num" w:pos="6480"/>
-        </w:tabs>
-        <w:ind w:left="6480" w:hanging="360"/>
-      </w:pPr>
-      <w:rPr>
-        <w:rFonts w:ascii="Symbol" w:hAnsi="Symbol" w:hint="default"/>
-        <w:sz w:val="20"/>
-      </w:rPr>
-    </w:lvl>
-  </w:abstractNum>
-  <w:abstractNum w:abstractNumId="15" w15:restartNumberingAfterBreak="0">
-    <w:nsid w:val="6F2E782C"/>
-    <w:multiLevelType w:val="multilevel"/>
-    <w:tmpl w:val="F2289FDA"/>
-    <w:lvl w:ilvl="0">
-      <w:start w:val="1"/>
-      <w:numFmt w:val="bullet"/>
-      <w:lvlText w:val=""/>
-      <w:lvlJc w:val="left"/>
-      <w:pPr>
-        <w:tabs>
-          <w:tab w:val="num" w:pos="720"/>
-        </w:tabs>
-        <w:ind w:left="720" w:hanging="360"/>
-      </w:pPr>
-      <w:rPr>
-        <w:rFonts w:ascii="Symbol" w:hAnsi="Symbol" w:hint="default"/>
-        <w:sz w:val="20"/>
-      </w:rPr>
-    </w:lvl>
-    <w:lvl w:ilvl="1" w:tentative="1">
-      <w:start w:val="1"/>
-      <w:numFmt w:val="bullet"/>
-      <w:lvlText w:val=""/>
-      <w:lvlJc w:val="left"/>
-      <w:pPr>
-        <w:tabs>
-          <w:tab w:val="num" w:pos="1440"/>
-        </w:tabs>
-        <w:ind w:left="1440" w:hanging="360"/>
-      </w:pPr>
-      <w:rPr>
-        <w:rFonts w:ascii="Symbol" w:hAnsi="Symbol" w:hint="default"/>
-        <w:sz w:val="20"/>
-      </w:rPr>
-    </w:lvl>
-    <w:lvl w:ilvl="2" w:tentative="1">
-      <w:start w:val="1"/>
-      <w:numFmt w:val="bullet"/>
-      <w:lvlText w:val=""/>
-      <w:lvlJc w:val="left"/>
-      <w:pPr>
-        <w:tabs>
-          <w:tab w:val="num" w:pos="2160"/>
-        </w:tabs>
-        <w:ind w:left="2160" w:hanging="360"/>
-      </w:pPr>
-      <w:rPr>
-        <w:rFonts w:ascii="Symbol" w:hAnsi="Symbol" w:hint="default"/>
-        <w:sz w:val="20"/>
-      </w:rPr>
-    </w:lvl>
-    <w:lvl w:ilvl="3" w:tentative="1">
-      <w:start w:val="1"/>
-      <w:numFmt w:val="bullet"/>
-      <w:lvlText w:val=""/>
-      <w:lvlJc w:val="left"/>
-      <w:pPr>
-        <w:tabs>
-          <w:tab w:val="num" w:pos="2880"/>
-        </w:tabs>
-        <w:ind w:left="2880" w:hanging="360"/>
-      </w:pPr>
-      <w:rPr>
-        <w:rFonts w:ascii="Symbol" w:hAnsi="Symbol" w:hint="default"/>
-        <w:sz w:val="20"/>
-      </w:rPr>
-    </w:lvl>
-    <w:lvl w:ilvl="4" w:tentative="1">
-      <w:start w:val="1"/>
-      <w:numFmt w:val="bullet"/>
-      <w:lvlText w:val=""/>
-      <w:lvlJc w:val="left"/>
-      <w:pPr>
-        <w:tabs>
-          <w:tab w:val="num" w:pos="3600"/>
-        </w:tabs>
-        <w:ind w:left="3600" w:hanging="360"/>
-      </w:pPr>
-      <w:rPr>
-        <w:rFonts w:ascii="Symbol" w:hAnsi="Symbol" w:hint="default"/>
-        <w:sz w:val="20"/>
-      </w:rPr>
-    </w:lvl>
-    <w:lvl w:ilvl="5" w:tentative="1">
-      <w:start w:val="1"/>
-      <w:numFmt w:val="bullet"/>
-      <w:lvlText w:val=""/>
-      <w:lvlJc w:val="left"/>
-      <w:pPr>
-        <w:tabs>
-          <w:tab w:val="num" w:pos="4320"/>
-        </w:tabs>
-        <w:ind w:left="4320" w:hanging="360"/>
-      </w:pPr>
-      <w:rPr>
-        <w:rFonts w:ascii="Symbol" w:hAnsi="Symbol" w:hint="default"/>
-        <w:sz w:val="20"/>
-      </w:rPr>
-    </w:lvl>
-    <w:lvl w:ilvl="6" w:tentative="1">
-      <w:start w:val="1"/>
-      <w:numFmt w:val="bullet"/>
-      <w:lvlText w:val=""/>
-      <w:lvlJc w:val="left"/>
-      <w:pPr>
-        <w:tabs>
-          <w:tab w:val="num" w:pos="5040"/>
-        </w:tabs>
-        <w:ind w:left="5040" w:hanging="360"/>
-      </w:pPr>
-      <w:rPr>
-        <w:rFonts w:ascii="Symbol" w:hAnsi="Symbol" w:hint="default"/>
-        <w:sz w:val="20"/>
-      </w:rPr>
-    </w:lvl>
-    <w:lvl w:ilvl="7" w:tentative="1">
-      <w:start w:val="1"/>
-      <w:numFmt w:val="bullet"/>
-      <w:lvlText w:val=""/>
-      <w:lvlJc w:val="left"/>
-      <w:pPr>
-        <w:tabs>
-          <w:tab w:val="num" w:pos="5760"/>
-        </w:tabs>
-        <w:ind w:left="5760" w:hanging="360"/>
-      </w:pPr>
-      <w:rPr>
-        <w:rFonts w:ascii="Symbol" w:hAnsi="Symbol" w:hint="default"/>
-        <w:sz w:val="20"/>
-      </w:rPr>
-    </w:lvl>
-    <w:lvl w:ilvl="8" w:tentative="1">
-      <w:start w:val="1"/>
-      <w:numFmt w:val="bullet"/>
-      <w:lvlText w:val=""/>
-      <w:lvlJc w:val="left"/>
-      <w:pPr>
-        <w:tabs>
-          <w:tab w:val="num" w:pos="6480"/>
-        </w:tabs>
-        <w:ind w:left="6480" w:hanging="360"/>
-      </w:pPr>
-      <w:rPr>
-        <w:rFonts w:ascii="Symbol" w:hAnsi="Symbol" w:hint="default"/>
-        <w:sz w:val="20"/>
-      </w:rPr>
-    </w:lvl>
-  </w:abstractNum>
-  <w:num w:numId="1" w16cid:durableId="62526534">
+  <w:num w:numId="1" w16cid:durableId="626744249">
     <w:abstractNumId w:val="8"/>
   </w:num>
-  <w:num w:numId="2" w16cid:durableId="224999598">
+  <w:num w:numId="2" w16cid:durableId="88357224">
     <w:abstractNumId w:val="6"/>
   </w:num>
-  <w:num w:numId="3" w16cid:durableId="147946275">
+  <w:num w:numId="3" w16cid:durableId="1373967545">
     <w:abstractNumId w:val="5"/>
   </w:num>
-  <w:num w:numId="4" w16cid:durableId="558974433">
+  <w:num w:numId="4" w16cid:durableId="1390110694">
     <w:abstractNumId w:val="4"/>
   </w:num>
-  <w:num w:numId="5" w16cid:durableId="2077893340">
+  <w:num w:numId="5" w16cid:durableId="690112721">
     <w:abstractNumId w:val="7"/>
   </w:num>
-  <w:num w:numId="6" w16cid:durableId="610472024">
+  <w:num w:numId="6" w16cid:durableId="667173252">
     <w:abstractNumId w:val="3"/>
   </w:num>
-  <w:num w:numId="7" w16cid:durableId="1695692267">
+  <w:num w:numId="7" w16cid:durableId="1103724396">
     <w:abstractNumId w:val="2"/>
   </w:num>
-  <w:num w:numId="8" w16cid:durableId="538005867">
+  <w:num w:numId="8" w16cid:durableId="929971704">
     <w:abstractNumId w:val="1"/>
   </w:num>
-  <w:num w:numId="9" w16cid:durableId="2144032847">
+  <w:num w:numId="9" w16cid:durableId="1248492260">
     <w:abstractNumId w:val="0"/>
-  </w:num>
-  <w:num w:numId="10" w16cid:durableId="1486122427">
-    <w:abstractNumId w:val="12"/>
-  </w:num>
-  <w:num w:numId="11" w16cid:durableId="1957054844">
-    <w:abstractNumId w:val="15"/>
-  </w:num>
-  <w:num w:numId="12" w16cid:durableId="2009942262">
-    <w:abstractNumId w:val="13"/>
-  </w:num>
-  <w:num w:numId="13" w16cid:durableId="1013992288">
-    <w:abstractNumId w:val="9"/>
-  </w:num>
-  <w:num w:numId="14" w16cid:durableId="563101761">
-    <w:abstractNumId w:val="14"/>
-  </w:num>
-  <w:num w:numId="15" w16cid:durableId="1441024806">
-    <w:abstractNumId w:val="11"/>
-  </w:num>
-  <w:num w:numId="16" w16cid:durableId="2113938380">
-    <w:abstractNumId w:val="10"/>
   </w:num>
 </w:numbering>
 </file>
@@ -5436,6 +1845,7 @@
   <w:style w:type="character" w:default="1" w:styleId="DefaultParagraphFont">
     <w:name w:val="Default Paragraph Font"/>
     <w:uiPriority w:val="1"/>
+    <w:semiHidden/>
     <w:unhideWhenUsed/>
   </w:style>
   <w:style w:type="table" w:default="1" w:styleId="TableNormal">

</xml_diff>